<commit_message>
fix: report data calculations, Wealthbox field mapping, professional template styling
- parseMoney() strips $,% from Schwab CSV values — fixes $0.00/NaN
- George Jetson: $334,580, +22.41% YTD, top holding SPY
- Wealthbox contacts matched by account_number custom field
- WB goals, background, risk tolerance flow into reports
- Professional template: navy header band, blue section borders,
  alternating row shading, 35 placeholder fields
- Added TOP_HOLDING, INVESTMENT_OBJECTIVE, TIME_HORIZON, BACKGROUND_INFO
  to Document Generator field mapping
- advisorName defaults to "Brett Stone", removed debug text from advisorNotes
- 7/7 reports generated successfully in SharePoint

Co-Authored-By: Claude Opus 4.6 (1M context) <noreply@anthropic.com>
</commit_message>
<xml_diff>
--- a/docs/templates/Quarterly-Review-TEMPLATE.docx
+++ b/docs/templates/Quarterly-Review-TEMPLATE.docx
@@ -2,64 +2,115 @@
 <file path=word/document.xml><?xml version="1.0" encoding="utf-8"?>
 <w:document xmlns:wpc="http://schemas.microsoft.com/office/word/2010/wordprocessingCanvas" xmlns:mc="http://schemas.openxmlformats.org/markup-compatibility/2006" xmlns:o="urn:schemas-microsoft-com:office:office" xmlns:r="http://schemas.openxmlformats.org/officeDocument/2006/relationships" xmlns:m="http://schemas.openxmlformats.org/officeDocument/2006/math" xmlns:v="urn:schemas-microsoft-com:vml" xmlns:wp14="http://schemas.microsoft.com/office/word/2010/wordprocessingDrawing" xmlns:wp="http://schemas.openxmlformats.org/drawingml/2006/wordprocessingDrawing" xmlns:w10="urn:schemas-microsoft-com:office:word" xmlns:w="http://schemas.openxmlformats.org/wordprocessingml/2006/main" xmlns:w14="http://schemas.microsoft.com/office/word/2010/wordml" xmlns:w15="http://schemas.microsoft.com/office/word/2012/wordml" xmlns:wpg="http://schemas.microsoft.com/office/word/2010/wordprocessingGroup" xmlns:wpi="http://schemas.microsoft.com/office/word/2010/wordprocessingInk" xmlns:wne="http://schemas.microsoft.com/office/word/2006/wordml" xmlns:wps="http://schemas.microsoft.com/office/word/2010/wordprocessingShape" xmlns:cx="http://schemas.microsoft.com/office/drawing/2014/chartex" xmlns:cx1="http://schemas.microsoft.com/office/drawing/2015/9/8/chartex" xmlns:cx2="http://schemas.microsoft.com/office/drawing/2015/10/21/chartex" xmlns:cx3="http://schemas.microsoft.com/office/drawing/2016/5/9/chartex" xmlns:cx4="http://schemas.microsoft.com/office/drawing/2016/5/10/chartex" xmlns:cx5="http://schemas.microsoft.com/office/drawing/2016/5/11/chartex" xmlns:cx6="http://schemas.microsoft.com/office/drawing/2016/5/12/chartex" xmlns:cx7="http://schemas.microsoft.com/office/drawing/2016/5/13/chartex" xmlns:cx8="http://schemas.microsoft.com/office/drawing/2016/5/14/chartex" xmlns:aink="http://schemas.microsoft.com/office/drawing/2016/ink" xmlns:am3d="http://schemas.microsoft.com/office/drawing/2017/model3d" xmlns:w16cex="http://schemas.microsoft.com/office/word/2018/wordml/cex" xmlns:w16cid="http://schemas.microsoft.com/office/word/2016/wordml/cid" xmlns:w16="http://schemas.microsoft.com/office/word/2018/wordml" xmlns:w16sdtdh="http://schemas.microsoft.com/office/word/2020/wordml/sdtdatahash" xmlns:w16se="http://schemas.microsoft.com/office/word/2015/wordml/symex" mc:Ignorable="w14 w15 wp14">
   <w:body>
-    <w:p>
-      <w:pPr>
-        <w:spacing w:after="40"/>
-        <w:jc w:val="center"/>
-      </w:pPr>
-      <w:r>
-        <w:rPr>
-          <w:b/>
-          <w:bCs/>
-          <w:color w:val="1a3c6e"/>
-          <w:sz w:val="36"/>
-          <w:szCs w:val="36"/>
-        </w:rPr>
-        <w:t xml:space="preserve">{{FIRM_NAME}}</w:t>
-      </w:r>
-    </w:p>
-    <w:p>
-      <w:pPr>
-        <w:spacing w:after="200"/>
-        <w:jc w:val="center"/>
-      </w:pPr>
-      <w:r>
-        <w:rPr>
-          <w:i/>
-          <w:iCs/>
-          <w:color w:val="666666"/>
-          <w:sz w:val="28"/>
-          <w:szCs w:val="28"/>
-        </w:rPr>
-        <w:t xml:space="preserve">Quarterly Investment Review</w:t>
-      </w:r>
-    </w:p>
-    <w:p>
-      <w:pPr>
-        <w:pStyle w:val="Heading2"/>
-        <w:spacing w:after="100" w:before="300"/>
-      </w:pPr>
-      <w:r>
-        <w:rPr>
-          <w:b/>
-          <w:bCs/>
-          <w:color w:val="1a3c6e"/>
-          <w:sz w:val="24"/>
-          <w:szCs w:val="24"/>
-        </w:rPr>
-        <w:t xml:space="preserve">Client Information</w:t>
-      </w:r>
-    </w:p>
     <w:tbl>
       <w:tblPr>
         <w:tblW w:type="pct" w:w="100%"/>
         <w:tblBorders>
-          <w:top w:val="none" w:color="FFFFFF" w:sz="0"/>
-          <w:left w:val="none" w:color="FFFFFF" w:sz="0"/>
-          <w:bottom w:val="none" w:color="FFFFFF" w:sz="0"/>
-          <w:right w:val="none" w:color="FFFFFF" w:sz="0"/>
-          <w:insideH w:val="none" w:color="FFFFFF" w:sz="0"/>
-          <w:insideV w:val="none" w:color="FFFFFF" w:sz="0"/>
+          <w:top w:val="none" w:sz="0"/>
+          <w:left w:val="none" w:sz="0"/>
+          <w:bottom w:val="none" w:sz="0"/>
+          <w:right w:val="none" w:sz="0"/>
+          <w:insideH w:val="none" w:sz="0"/>
+          <w:insideV w:val="none" w:sz="0"/>
+        </w:tblBorders>
+      </w:tblPr>
+      <w:tblGrid>
+        <w:gridCol w:w="100"/>
+      </w:tblGrid>
+      <w:tr>
+        <w:tc>
+          <w:tcPr>
+            <w:tcW w:type="dxa" w:w="10000"/>
+            <w:shd w:color="1B3A5C" w:val="solid"/>
+            <w:tcMar>
+              <w:top w:type="dxa" w:w="120"/>
+              <w:left w:type="dxa" w:w="200"/>
+              <w:bottom w:type="dxa" w:w="120"/>
+              <w:right w:type="dxa" w:w="200"/>
+            </w:tcMar>
+          </w:tcPr>
+          <w:p>
+            <w:r>
+              <w:rPr>
+                <w:rFonts w:ascii="Calibri" w:cs="Calibri" w:eastAsia="Calibri" w:hAnsi="Calibri"/>
+                <w:b/>
+                <w:bCs/>
+                <w:color w:val="FFFFFF"/>
+                <w:sz w:val="36"/>
+                <w:szCs w:val="36"/>
+              </w:rPr>
+              <w:t xml:space="preserve">DAX</w:t>
+            </w:r>
+            <w:r>
+              <w:rPr>
+                <w:rFonts w:ascii="Calibri" w:cs="Calibri" w:eastAsia="Calibri" w:hAnsi="Calibri"/>
+                <w:color w:val="D6E4F0"/>
+                <w:sz w:val="28"/>
+                <w:szCs w:val="28"/>
+              </w:rPr>
+              <w:t xml:space="preserve">  |  Quarterly Investment Review</w:t>
+            </w:r>
+          </w:p>
+          <w:p>
+            <w:pPr>
+              <w:spacing w:before="60"/>
+            </w:pPr>
+            <w:r>
+              <w:rPr>
+                <w:rFonts w:ascii="Calibri" w:cs="Calibri" w:eastAsia="Calibri" w:hAnsi="Calibri"/>
+                <w:color w:val="D6E4F0"/>
+                <w:sz w:val="22"/>
+                <w:szCs w:val="22"/>
+              </w:rPr>
+              <w:t xml:space="preserve">{{FIRM_NAME}}</w:t>
+            </w:r>
+            <w:r>
+              <w:rPr>
+                <w:rFonts w:ascii="Calibri" w:cs="Calibri" w:eastAsia="Calibri" w:hAnsi="Calibri"/>
+                <w:color w:val="D6E4F0"/>
+                <w:sz w:val="22"/>
+                <w:szCs w:val="22"/>
+              </w:rPr>
+              <w:t xml:space="preserve">  |  {{REPORT_PERIOD}}</w:t>
+            </w:r>
+          </w:p>
+        </w:tc>
+      </w:tr>
+    </w:tbl>
+    <w:p>
+      <w:pPr>
+        <w:spacing w:after="200"/>
+      </w:pPr>
+    </w:p>
+    <w:p>
+      <w:pPr>
+        <w:pBdr>
+          <w:bottom w:val="single" w:color="2E6DA4" w:sz="2"/>
+        </w:pBdr>
+        <w:spacing w:after="120" w:before="300"/>
+      </w:pPr>
+      <w:r>
+        <w:rPr>
+          <w:rFonts w:ascii="Calibri" w:cs="Calibri" w:eastAsia="Calibri" w:hAnsi="Calibri"/>
+          <w:b/>
+          <w:bCs/>
+          <w:color w:val="1B3A5C"/>
+          <w:sz w:val="26"/>
+          <w:szCs w:val="26"/>
+        </w:rPr>
+        <w:t xml:space="preserve">Client Information</w:t>
+      </w:r>
+    </w:p>
+    <w:tbl>
+      <w:tblPr>
+        <w:tblW w:type="pct" w:w="100%"/>
+        <w:tblBorders>
+          <w:top w:val="none" w:sz="0"/>
+          <w:left w:val="none" w:sz="0"/>
+          <w:bottom w:val="none" w:sz="0"/>
+          <w:right w:val="none" w:sz="0"/>
+          <w:insideH w:val="none" w:sz="0"/>
+          <w:insideV w:val="none" w:sz="0"/>
         </w:tblBorders>
       </w:tblPr>
       <w:tblGrid>
@@ -72,12 +123,22 @@
         <w:tc>
           <w:tcPr>
             <w:tcW w:type="dxa" w:w="1800"/>
-          </w:tcPr>
-          <w:p>
-            <w:r>
-              <w:rPr>
-                <w:sz w:val="20"/>
-                <w:szCs w:val="20"/>
+            <w:tcMar>
+              <w:top w:type="dxa" w:w="30"/>
+              <w:left w:type="dxa" w:w="80"/>
+              <w:bottom w:type="dxa" w:w="30"/>
+              <w:right w:type="dxa" w:w="80"/>
+            </w:tcMar>
+          </w:tcPr>
+          <w:p>
+            <w:r>
+              <w:rPr>
+                <w:rFonts w:ascii="Calibri" w:cs="Calibri" w:eastAsia="Calibri" w:hAnsi="Calibri"/>
+                <w:b/>
+                <w:bCs/>
+                <w:color w:val="555555"/>
+                <w:sz w:val="19"/>
+                <w:szCs w:val="19"/>
               </w:rPr>
               <w:t xml:space="preserve">Client:</w:t>
             </w:r>
@@ -86,10 +147,18 @@
         <w:tc>
           <w:tcPr>
             <w:tcW w:type="dxa" w:w="3200"/>
-          </w:tcPr>
-          <w:p>
-            <w:r>
-              <w:rPr>
+            <w:tcMar>
+              <w:top w:type="dxa" w:w="30"/>
+              <w:left w:type="dxa" w:w="80"/>
+              <w:bottom w:type="dxa" w:w="30"/>
+              <w:right w:type="dxa" w:w="80"/>
+            </w:tcMar>
+          </w:tcPr>
+          <w:p>
+            <w:r>
+              <w:rPr>
+                <w:rFonts w:ascii="Calibri" w:cs="Calibri" w:eastAsia="Calibri" w:hAnsi="Calibri"/>
+                <w:color w:val="2C3E50"/>
                 <w:sz w:val="20"/>
                 <w:szCs w:val="20"/>
               </w:rPr>
@@ -100,12 +169,22 @@
         <w:tc>
           <w:tcPr>
             <w:tcW w:type="dxa" w:w="1800"/>
-          </w:tcPr>
-          <w:p>
-            <w:r>
-              <w:rPr>
-                <w:sz w:val="20"/>
-                <w:szCs w:val="20"/>
+            <w:tcMar>
+              <w:top w:type="dxa" w:w="30"/>
+              <w:left w:type="dxa" w:w="80"/>
+              <w:bottom w:type="dxa" w:w="30"/>
+              <w:right w:type="dxa" w:w="80"/>
+            </w:tcMar>
+          </w:tcPr>
+          <w:p>
+            <w:r>
+              <w:rPr>
+                <w:rFonts w:ascii="Calibri" w:cs="Calibri" w:eastAsia="Calibri" w:hAnsi="Calibri"/>
+                <w:b/>
+                <w:bCs/>
+                <w:color w:val="555555"/>
+                <w:sz w:val="19"/>
+                <w:szCs w:val="19"/>
               </w:rPr>
               <w:t xml:space="preserve">Account #:</w:t>
             </w:r>
@@ -114,10 +193,18 @@
         <w:tc>
           <w:tcPr>
             <w:tcW w:type="dxa" w:w="3200"/>
-          </w:tcPr>
-          <w:p>
-            <w:r>
-              <w:rPr>
+            <w:tcMar>
+              <w:top w:type="dxa" w:w="30"/>
+              <w:left w:type="dxa" w:w="80"/>
+              <w:bottom w:type="dxa" w:w="30"/>
+              <w:right w:type="dxa" w:w="80"/>
+            </w:tcMar>
+          </w:tcPr>
+          <w:p>
+            <w:r>
+              <w:rPr>
+                <w:rFonts w:ascii="Calibri" w:cs="Calibri" w:eastAsia="Calibri" w:hAnsi="Calibri"/>
+                <w:color w:val="2C3E50"/>
                 <w:sz w:val="20"/>
                 <w:szCs w:val="20"/>
               </w:rPr>
@@ -130,12 +217,22 @@
         <w:tc>
           <w:tcPr>
             <w:tcW w:type="dxa" w:w="1800"/>
-          </w:tcPr>
-          <w:p>
-            <w:r>
-              <w:rPr>
-                <w:sz w:val="20"/>
-                <w:szCs w:val="20"/>
+            <w:tcMar>
+              <w:top w:type="dxa" w:w="30"/>
+              <w:left w:type="dxa" w:w="80"/>
+              <w:bottom w:type="dxa" w:w="30"/>
+              <w:right w:type="dxa" w:w="80"/>
+            </w:tcMar>
+          </w:tcPr>
+          <w:p>
+            <w:r>
+              <w:rPr>
+                <w:rFonts w:ascii="Calibri" w:cs="Calibri" w:eastAsia="Calibri" w:hAnsi="Calibri"/>
+                <w:b/>
+                <w:bCs/>
+                <w:color w:val="555555"/>
+                <w:sz w:val="19"/>
+                <w:szCs w:val="19"/>
               </w:rPr>
               <w:t xml:space="preserve">Account Type:</w:t>
             </w:r>
@@ -144,10 +241,18 @@
         <w:tc>
           <w:tcPr>
             <w:tcW w:type="dxa" w:w="3200"/>
-          </w:tcPr>
-          <w:p>
-            <w:r>
-              <w:rPr>
+            <w:tcMar>
+              <w:top w:type="dxa" w:w="30"/>
+              <w:left w:type="dxa" w:w="80"/>
+              <w:bottom w:type="dxa" w:w="30"/>
+              <w:right w:type="dxa" w:w="80"/>
+            </w:tcMar>
+          </w:tcPr>
+          <w:p>
+            <w:r>
+              <w:rPr>
+                <w:rFonts w:ascii="Calibri" w:cs="Calibri" w:eastAsia="Calibri" w:hAnsi="Calibri"/>
+                <w:color w:val="2C3E50"/>
                 <w:sz w:val="20"/>
                 <w:szCs w:val="20"/>
               </w:rPr>
@@ -158,12 +263,22 @@
         <w:tc>
           <w:tcPr>
             <w:tcW w:type="dxa" w:w="1800"/>
-          </w:tcPr>
-          <w:p>
-            <w:r>
-              <w:rPr>
-                <w:sz w:val="20"/>
-                <w:szCs w:val="20"/>
+            <w:tcMar>
+              <w:top w:type="dxa" w:w="30"/>
+              <w:left w:type="dxa" w:w="80"/>
+              <w:bottom w:type="dxa" w:w="30"/>
+              <w:right w:type="dxa" w:w="80"/>
+            </w:tcMar>
+          </w:tcPr>
+          <w:p>
+            <w:r>
+              <w:rPr>
+                <w:rFonts w:ascii="Calibri" w:cs="Calibri" w:eastAsia="Calibri" w:hAnsi="Calibri"/>
+                <w:b/>
+                <w:bCs/>
+                <w:color w:val="555555"/>
+                <w:sz w:val="19"/>
+                <w:szCs w:val="19"/>
               </w:rPr>
               <w:t xml:space="preserve">Report Period:</w:t>
             </w:r>
@@ -172,10 +287,18 @@
         <w:tc>
           <w:tcPr>
             <w:tcW w:type="dxa" w:w="3200"/>
-          </w:tcPr>
-          <w:p>
-            <w:r>
-              <w:rPr>
+            <w:tcMar>
+              <w:top w:type="dxa" w:w="30"/>
+              <w:left w:type="dxa" w:w="80"/>
+              <w:bottom w:type="dxa" w:w="30"/>
+              <w:right w:type="dxa" w:w="80"/>
+            </w:tcMar>
+          </w:tcPr>
+          <w:p>
+            <w:r>
+              <w:rPr>
+                <w:rFonts w:ascii="Calibri" w:cs="Calibri" w:eastAsia="Calibri" w:hAnsi="Calibri"/>
+                <w:color w:val="2C3E50"/>
                 <w:sz w:val="20"/>
                 <w:szCs w:val="20"/>
               </w:rPr>
@@ -188,12 +311,22 @@
         <w:tc>
           <w:tcPr>
             <w:tcW w:type="dxa" w:w="1800"/>
-          </w:tcPr>
-          <w:p>
-            <w:r>
-              <w:rPr>
-                <w:sz w:val="20"/>
-                <w:szCs w:val="20"/>
+            <w:tcMar>
+              <w:top w:type="dxa" w:w="30"/>
+              <w:left w:type="dxa" w:w="80"/>
+              <w:bottom w:type="dxa" w:w="30"/>
+              <w:right w:type="dxa" w:w="80"/>
+            </w:tcMar>
+          </w:tcPr>
+          <w:p>
+            <w:r>
+              <w:rPr>
+                <w:rFonts w:ascii="Calibri" w:cs="Calibri" w:eastAsia="Calibri" w:hAnsi="Calibri"/>
+                <w:b/>
+                <w:bCs/>
+                <w:color w:val="555555"/>
+                <w:sz w:val="19"/>
+                <w:szCs w:val="19"/>
               </w:rPr>
               <w:t xml:space="preserve">Advisor:</w:t>
             </w:r>
@@ -202,10 +335,18 @@
         <w:tc>
           <w:tcPr>
             <w:tcW w:type="dxa" w:w="3200"/>
-          </w:tcPr>
-          <w:p>
-            <w:r>
-              <w:rPr>
+            <w:tcMar>
+              <w:top w:type="dxa" w:w="30"/>
+              <w:left w:type="dxa" w:w="80"/>
+              <w:bottom w:type="dxa" w:w="30"/>
+              <w:right w:type="dxa" w:w="80"/>
+            </w:tcMar>
+          </w:tcPr>
+          <w:p>
+            <w:r>
+              <w:rPr>
+                <w:rFonts w:ascii="Calibri" w:cs="Calibri" w:eastAsia="Calibri" w:hAnsi="Calibri"/>
+                <w:color w:val="2C3E50"/>
                 <w:sz w:val="20"/>
                 <w:szCs w:val="20"/>
               </w:rPr>
@@ -216,12 +357,22 @@
         <w:tc>
           <w:tcPr>
             <w:tcW w:type="dxa" w:w="1800"/>
-          </w:tcPr>
-          <w:p>
-            <w:r>
-              <w:rPr>
-                <w:sz w:val="20"/>
-                <w:szCs w:val="20"/>
+            <w:tcMar>
+              <w:top w:type="dxa" w:w="30"/>
+              <w:left w:type="dxa" w:w="80"/>
+              <w:bottom w:type="dxa" w:w="30"/>
+              <w:right w:type="dxa" w:w="80"/>
+            </w:tcMar>
+          </w:tcPr>
+          <w:p>
+            <w:r>
+              <w:rPr>
+                <w:rFonts w:ascii="Calibri" w:cs="Calibri" w:eastAsia="Calibri" w:hAnsi="Calibri"/>
+                <w:b/>
+                <w:bCs/>
+                <w:color w:val="555555"/>
+                <w:sz w:val="19"/>
+                <w:szCs w:val="19"/>
               </w:rPr>
               <w:t xml:space="preserve">Report Date:</w:t>
             </w:r>
@@ -230,10 +381,18 @@
         <w:tc>
           <w:tcPr>
             <w:tcW w:type="dxa" w:w="3200"/>
-          </w:tcPr>
-          <w:p>
-            <w:r>
-              <w:rPr>
+            <w:tcMar>
+              <w:top w:type="dxa" w:w="30"/>
+              <w:left w:type="dxa" w:w="80"/>
+              <w:bottom w:type="dxa" w:w="30"/>
+              <w:right w:type="dxa" w:w="80"/>
+            </w:tcMar>
+          </w:tcPr>
+          <w:p>
+            <w:r>
+              <w:rPr>
+                <w:rFonts w:ascii="Calibri" w:cs="Calibri" w:eastAsia="Calibri" w:hAnsi="Calibri"/>
+                <w:color w:val="2C3E50"/>
                 <w:sz w:val="20"/>
                 <w:szCs w:val="20"/>
               </w:rPr>
@@ -245,21 +404,24 @@
     </w:tbl>
     <w:p>
       <w:pPr>
-        <w:spacing w:after="80"/>
-      </w:pPr>
-    </w:p>
-    <w:p>
-      <w:pPr>
-        <w:pStyle w:val="Heading2"/>
-        <w:spacing w:after="100" w:before="300"/>
+        <w:spacing w:after="100"/>
+      </w:pPr>
+    </w:p>
+    <w:p>
+      <w:pPr>
+        <w:pBdr>
+          <w:bottom w:val="single" w:color="2E6DA4" w:sz="2"/>
+        </w:pBdr>
+        <w:spacing w:after="120" w:before="300"/>
       </w:pPr>
       <w:r>
         <w:rPr>
+          <w:rFonts w:ascii="Calibri" w:cs="Calibri" w:eastAsia="Calibri" w:hAnsi="Calibri"/>
           <w:b/>
           <w:bCs/>
-          <w:color w:val="1a3c6e"/>
-          <w:sz w:val="24"/>
-          <w:szCs w:val="24"/>
+          <w:color w:val="1B3A5C"/>
+          <w:sz w:val="26"/>
+          <w:szCs w:val="26"/>
         </w:rPr>
         <w:t xml:space="preserve">Portfolio Performance</w:t>
       </w:r>
@@ -286,12 +448,19 @@
       <w:tr>
         <w:tc>
           <w:tcPr>
-            <w:tcW w:type="dxa" w:w="2500"/>
-            <w:shd w:color="1a3c6e" w:val="solid"/>
-          </w:tcPr>
-          <w:p>
-            <w:r>
-              <w:rPr>
+            <w:tcW w:type="dxa" w:w="2200"/>
+            <w:shd w:color="1B3A5C" w:val="solid"/>
+            <w:tcMar>
+              <w:top w:type="dxa" w:w="40"/>
+              <w:left w:type="dxa" w:w="80"/>
+              <w:bottom w:type="dxa" w:w="40"/>
+              <w:right w:type="dxa" w:w="80"/>
+            </w:tcMar>
+          </w:tcPr>
+          <w:p>
+            <w:r>
+              <w:rPr>
+                <w:rFonts w:ascii="Calibri" w:cs="Calibri" w:eastAsia="Calibri" w:hAnsi="Calibri"/>
                 <w:b/>
                 <w:bCs/>
                 <w:color w:val="FFFFFF"/>
@@ -304,12 +473,19 @@
         </w:tc>
         <w:tc>
           <w:tcPr>
-            <w:tcW w:type="dxa" w:w="2000"/>
-            <w:shd w:color="1a3c6e" w:val="solid"/>
-          </w:tcPr>
-          <w:p>
-            <w:r>
-              <w:rPr>
+            <w:tcW w:type="dxa" w:w="1800"/>
+            <w:shd w:color="1B3A5C" w:val="solid"/>
+            <w:tcMar>
+              <w:top w:type="dxa" w:w="40"/>
+              <w:left w:type="dxa" w:w="80"/>
+              <w:bottom w:type="dxa" w:w="40"/>
+              <w:right w:type="dxa" w:w="80"/>
+            </w:tcMar>
+          </w:tcPr>
+          <w:p>
+            <w:r>
+              <w:rPr>
+                <w:rFonts w:ascii="Calibri" w:cs="Calibri" w:eastAsia="Calibri" w:hAnsi="Calibri"/>
                 <w:b/>
                 <w:bCs/>
                 <w:color w:val="FFFFFF"/>
@@ -322,12 +498,19 @@
         </w:tc>
         <w:tc>
           <w:tcPr>
-            <w:tcW w:type="dxa" w:w="2000"/>
-            <w:shd w:color="1a3c6e" w:val="solid"/>
-          </w:tcPr>
-          <w:p>
-            <w:r>
-              <w:rPr>
+            <w:tcW w:type="dxa" w:w="1800"/>
+            <w:shd w:color="1B3A5C" w:val="solid"/>
+            <w:tcMar>
+              <w:top w:type="dxa" w:w="40"/>
+              <w:left w:type="dxa" w:w="80"/>
+              <w:bottom w:type="dxa" w:w="40"/>
+              <w:right w:type="dxa" w:w="80"/>
+            </w:tcMar>
+          </w:tcPr>
+          <w:p>
+            <w:r>
+              <w:rPr>
+                <w:rFonts w:ascii="Calibri" w:cs="Calibri" w:eastAsia="Calibri" w:hAnsi="Calibri"/>
                 <w:b/>
                 <w:bCs/>
                 <w:color w:val="FFFFFF"/>
@@ -340,12 +523,19 @@
         </w:tc>
         <w:tc>
           <w:tcPr>
-            <w:tcW w:type="dxa" w:w="2000"/>
-            <w:shd w:color="1a3c6e" w:val="solid"/>
-          </w:tcPr>
-          <w:p>
-            <w:r>
-              <w:rPr>
+            <w:tcW w:type="dxa" w:w="1800"/>
+            <w:shd w:color="1B3A5C" w:val="solid"/>
+            <w:tcMar>
+              <w:top w:type="dxa" w:w="40"/>
+              <w:left w:type="dxa" w:w="80"/>
+              <w:bottom w:type="dxa" w:w="40"/>
+              <w:right w:type="dxa" w:w="80"/>
+            </w:tcMar>
+          </w:tcPr>
+          <w:p>
+            <w:r>
+              <w:rPr>
+                <w:rFonts w:ascii="Calibri" w:cs="Calibri" w:eastAsia="Calibri" w:hAnsi="Calibri"/>
                 <w:b/>
                 <w:bCs/>
                 <w:color w:val="FFFFFF"/>
@@ -358,12 +548,19 @@
         </w:tc>
         <w:tc>
           <w:tcPr>
-            <w:tcW w:type="dxa" w:w="2000"/>
-            <w:shd w:color="1a3c6e" w:val="solid"/>
-          </w:tcPr>
-          <w:p>
-            <w:r>
-              <w:rPr>
+            <w:tcW w:type="dxa" w:w="2400"/>
+            <w:shd w:color="1B3A5C" w:val="solid"/>
+            <w:tcMar>
+              <w:top w:type="dxa" w:w="40"/>
+              <w:left w:type="dxa" w:w="80"/>
+              <w:bottom w:type="dxa" w:w="40"/>
+              <w:right w:type="dxa" w:w="80"/>
+            </w:tcMar>
+          </w:tcPr>
+          <w:p>
+            <w:r>
+              <w:rPr>
+                <w:rFonts w:ascii="Calibri" w:cs="Calibri" w:eastAsia="Calibri" w:hAnsi="Calibri"/>
                 <w:b/>
                 <w:bCs/>
                 <w:color w:val="FFFFFF"/>
@@ -378,11 +575,20 @@
       <w:tr>
         <w:tc>
           <w:tcPr>
-            <w:tcW w:type="dxa" w:w="2500"/>
-          </w:tcPr>
-          <w:p>
-            <w:r>
-              <w:rPr>
+            <w:tcW w:type="dxa" w:w="2200"/>
+            <w:shd w:color="D6E4F0" w:val="solid"/>
+            <w:tcMar>
+              <w:top w:type="dxa" w:w="30"/>
+              <w:left w:type="dxa" w:w="80"/>
+              <w:bottom w:type="dxa" w:w="30"/>
+              <w:right w:type="dxa" w:w="80"/>
+            </w:tcMar>
+          </w:tcPr>
+          <w:p>
+            <w:r>
+              <w:rPr>
+                <w:rFonts w:ascii="Calibri" w:cs="Calibri" w:eastAsia="Calibri" w:hAnsi="Calibri"/>
+                <w:color w:val="2C3E50"/>
                 <w:sz w:val="20"/>
                 <w:szCs w:val="20"/>
               </w:rPr>
@@ -392,11 +598,20 @@
         </w:tc>
         <w:tc>
           <w:tcPr>
-            <w:tcW w:type="dxa" w:w="2000"/>
-          </w:tcPr>
-          <w:p>
-            <w:r>
-              <w:rPr>
+            <w:tcW w:type="dxa" w:w="1800"/>
+            <w:shd w:color="D6E4F0" w:val="solid"/>
+            <w:tcMar>
+              <w:top w:type="dxa" w:w="30"/>
+              <w:left w:type="dxa" w:w="80"/>
+              <w:bottom w:type="dxa" w:w="30"/>
+              <w:right w:type="dxa" w:w="80"/>
+            </w:tcMar>
+          </w:tcPr>
+          <w:p>
+            <w:r>
+              <w:rPr>
+                <w:rFonts w:ascii="Calibri" w:cs="Calibri" w:eastAsia="Calibri" w:hAnsi="Calibri"/>
+                <w:color w:val="2C3E50"/>
                 <w:sz w:val="20"/>
                 <w:szCs w:val="20"/>
               </w:rPr>
@@ -406,11 +621,20 @@
         </w:tc>
         <w:tc>
           <w:tcPr>
-            <w:tcW w:type="dxa" w:w="2000"/>
-          </w:tcPr>
-          <w:p>
-            <w:r>
-              <w:rPr>
+            <w:tcW w:type="dxa" w:w="1800"/>
+            <w:shd w:color="D6E4F0" w:val="solid"/>
+            <w:tcMar>
+              <w:top w:type="dxa" w:w="30"/>
+              <w:left w:type="dxa" w:w="80"/>
+              <w:bottom w:type="dxa" w:w="30"/>
+              <w:right w:type="dxa" w:w="80"/>
+            </w:tcMar>
+          </w:tcPr>
+          <w:p>
+            <w:r>
+              <w:rPr>
+                <w:rFonts w:ascii="Calibri" w:cs="Calibri" w:eastAsia="Calibri" w:hAnsi="Calibri"/>
+                <w:color w:val="2C3E50"/>
                 <w:sz w:val="20"/>
                 <w:szCs w:val="20"/>
               </w:rPr>
@@ -420,11 +644,20 @@
         </w:tc>
         <w:tc>
           <w:tcPr>
-            <w:tcW w:type="dxa" w:w="2000"/>
-          </w:tcPr>
-          <w:p>
-            <w:r>
-              <w:rPr>
+            <w:tcW w:type="dxa" w:w="1800"/>
+            <w:shd w:color="D6E4F0" w:val="solid"/>
+            <w:tcMar>
+              <w:top w:type="dxa" w:w="30"/>
+              <w:left w:type="dxa" w:w="80"/>
+              <w:bottom w:type="dxa" w:w="30"/>
+              <w:right w:type="dxa" w:w="80"/>
+            </w:tcMar>
+          </w:tcPr>
+          <w:p>
+            <w:r>
+              <w:rPr>
+                <w:rFonts w:ascii="Calibri" w:cs="Calibri" w:eastAsia="Calibri" w:hAnsi="Calibri"/>
+                <w:color w:val="2C3E50"/>
                 <w:sz w:val="20"/>
                 <w:szCs w:val="20"/>
               </w:rPr>
@@ -434,11 +667,20 @@
         </w:tc>
         <w:tc>
           <w:tcPr>
-            <w:tcW w:type="dxa" w:w="2000"/>
-          </w:tcPr>
-          <w:p>
-            <w:r>
-              <w:rPr>
+            <w:tcW w:type="dxa" w:w="2400"/>
+            <w:shd w:color="D6E4F0" w:val="solid"/>
+            <w:tcMar>
+              <w:top w:type="dxa" w:w="30"/>
+              <w:left w:type="dxa" w:w="80"/>
+              <w:bottom w:type="dxa" w:w="30"/>
+              <w:right w:type="dxa" w:w="80"/>
+            </w:tcMar>
+          </w:tcPr>
+          <w:p>
+            <w:r>
+              <w:rPr>
+                <w:rFonts w:ascii="Calibri" w:cs="Calibri" w:eastAsia="Calibri" w:hAnsi="Calibri"/>
+                <w:color w:val="2C3E50"/>
                 <w:sz w:val="20"/>
                 <w:szCs w:val="20"/>
               </w:rPr>
@@ -450,21 +692,24 @@
     </w:tbl>
     <w:p>
       <w:pPr>
-        <w:spacing w:after="80"/>
-      </w:pPr>
-    </w:p>
-    <w:p>
-      <w:pPr>
-        <w:pStyle w:val="Heading2"/>
-        <w:spacing w:after="100" w:before="300"/>
+        <w:spacing w:after="100"/>
+      </w:pPr>
+    </w:p>
+    <w:p>
+      <w:pPr>
+        <w:pBdr>
+          <w:bottom w:val="single" w:color="2E6DA4" w:sz="2"/>
+        </w:pBdr>
+        <w:spacing w:after="120" w:before="300"/>
       </w:pPr>
       <w:r>
         <w:rPr>
+          <w:rFonts w:ascii="Calibri" w:cs="Calibri" w:eastAsia="Calibri" w:hAnsi="Calibri"/>
           <w:b/>
           <w:bCs/>
-          <w:color w:val="1a3c6e"/>
-          <w:sz w:val="24"/>
-          <w:szCs w:val="24"/>
+          <w:color w:val="1B3A5C"/>
+          <w:sz w:val="26"/>
+          <w:szCs w:val="26"/>
         </w:rPr>
         <w:t xml:space="preserve">Client Profile</w:t>
       </w:r>
@@ -473,12 +718,12 @@
       <w:tblPr>
         <w:tblW w:type="pct" w:w="100%"/>
         <w:tblBorders>
-          <w:top w:val="none" w:color="FFFFFF" w:sz="0"/>
-          <w:left w:val="none" w:color="FFFFFF" w:sz="0"/>
-          <w:bottom w:val="none" w:color="FFFFFF" w:sz="0"/>
-          <w:right w:val="none" w:color="FFFFFF" w:sz="0"/>
-          <w:insideH w:val="none" w:color="FFFFFF" w:sz="0"/>
-          <w:insideV w:val="none" w:color="FFFFFF" w:sz="0"/>
+          <w:top w:val="none" w:sz="0"/>
+          <w:left w:val="none" w:sz="0"/>
+          <w:bottom w:val="none" w:sz="0"/>
+          <w:right w:val="none" w:sz="0"/>
+          <w:insideH w:val="none" w:sz="0"/>
+          <w:insideV w:val="none" w:sz="0"/>
         </w:tblBorders>
       </w:tblPr>
       <w:tblGrid>
@@ -490,13 +735,23 @@
       <w:tr>
         <w:tc>
           <w:tcPr>
-            <w:tcW w:type="dxa" w:w="2200"/>
-          </w:tcPr>
-          <w:p>
-            <w:r>
-              <w:rPr>
-                <w:sz w:val="20"/>
-                <w:szCs w:val="20"/>
+            <w:tcW w:type="dxa" w:w="1800"/>
+            <w:tcMar>
+              <w:top w:type="dxa" w:w="30"/>
+              <w:left w:type="dxa" w:w="80"/>
+              <w:bottom w:type="dxa" w:w="30"/>
+              <w:right w:type="dxa" w:w="80"/>
+            </w:tcMar>
+          </w:tcPr>
+          <w:p>
+            <w:r>
+              <w:rPr>
+                <w:rFonts w:ascii="Calibri" w:cs="Calibri" w:eastAsia="Calibri" w:hAnsi="Calibri"/>
+                <w:b/>
+                <w:bCs/>
+                <w:color w:val="555555"/>
+                <w:sz w:val="19"/>
+                <w:szCs w:val="19"/>
               </w:rPr>
               <w:t xml:space="preserve">Risk Tolerance:</w:t>
             </w:r>
@@ -504,11 +759,19 @@
         </w:tc>
         <w:tc>
           <w:tcPr>
-            <w:tcW w:type="dxa" w:w="2800"/>
-          </w:tcPr>
-          <w:p>
-            <w:r>
-              <w:rPr>
+            <w:tcW w:type="dxa" w:w="3200"/>
+            <w:tcMar>
+              <w:top w:type="dxa" w:w="30"/>
+              <w:left w:type="dxa" w:w="80"/>
+              <w:bottom w:type="dxa" w:w="30"/>
+              <w:right w:type="dxa" w:w="80"/>
+            </w:tcMar>
+          </w:tcPr>
+          <w:p>
+            <w:r>
+              <w:rPr>
+                <w:rFonts w:ascii="Calibri" w:cs="Calibri" w:eastAsia="Calibri" w:hAnsi="Calibri"/>
+                <w:color w:val="2C3E50"/>
                 <w:sz w:val="20"/>
                 <w:szCs w:val="20"/>
               </w:rPr>
@@ -518,13 +781,23 @@
         </w:tc>
         <w:tc>
           <w:tcPr>
-            <w:tcW w:type="dxa" w:w="2200"/>
-          </w:tcPr>
-          <w:p>
-            <w:r>
-              <w:rPr>
-                <w:sz w:val="20"/>
-                <w:szCs w:val="20"/>
+            <w:tcW w:type="dxa" w:w="1800"/>
+            <w:tcMar>
+              <w:top w:type="dxa" w:w="30"/>
+              <w:left w:type="dxa" w:w="80"/>
+              <w:bottom w:type="dxa" w:w="30"/>
+              <w:right w:type="dxa" w:w="80"/>
+            </w:tcMar>
+          </w:tcPr>
+          <w:p>
+            <w:r>
+              <w:rPr>
+                <w:rFonts w:ascii="Calibri" w:cs="Calibri" w:eastAsia="Calibri" w:hAnsi="Calibri"/>
+                <w:b/>
+                <w:bCs/>
+                <w:color w:val="555555"/>
+                <w:sz w:val="19"/>
+                <w:szCs w:val="19"/>
               </w:rPr>
               <w:t xml:space="preserve">Objective:</w:t>
             </w:r>
@@ -532,11 +805,19 @@
         </w:tc>
         <w:tc>
           <w:tcPr>
-            <w:tcW w:type="dxa" w:w="2800"/>
-          </w:tcPr>
-          <w:p>
-            <w:r>
-              <w:rPr>
+            <w:tcW w:type="dxa" w:w="3200"/>
+            <w:tcMar>
+              <w:top w:type="dxa" w:w="30"/>
+              <w:left w:type="dxa" w:w="80"/>
+              <w:bottom w:type="dxa" w:w="30"/>
+              <w:right w:type="dxa" w:w="80"/>
+            </w:tcMar>
+          </w:tcPr>
+          <w:p>
+            <w:r>
+              <w:rPr>
+                <w:rFonts w:ascii="Calibri" w:cs="Calibri" w:eastAsia="Calibri" w:hAnsi="Calibri"/>
+                <w:color w:val="2C3E50"/>
                 <w:sz w:val="20"/>
                 <w:szCs w:val="20"/>
               </w:rPr>
@@ -548,13 +829,23 @@
       <w:tr>
         <w:tc>
           <w:tcPr>
-            <w:tcW w:type="dxa" w:w="2200"/>
-          </w:tcPr>
-          <w:p>
-            <w:r>
-              <w:rPr>
-                <w:sz w:val="20"/>
-                <w:szCs w:val="20"/>
+            <w:tcW w:type="dxa" w:w="1800"/>
+            <w:tcMar>
+              <w:top w:type="dxa" w:w="30"/>
+              <w:left w:type="dxa" w:w="80"/>
+              <w:bottom w:type="dxa" w:w="30"/>
+              <w:right w:type="dxa" w:w="80"/>
+            </w:tcMar>
+          </w:tcPr>
+          <w:p>
+            <w:r>
+              <w:rPr>
+                <w:rFonts w:ascii="Calibri" w:cs="Calibri" w:eastAsia="Calibri" w:hAnsi="Calibri"/>
+                <w:b/>
+                <w:bCs/>
+                <w:color w:val="555555"/>
+                <w:sz w:val="19"/>
+                <w:szCs w:val="19"/>
               </w:rPr>
               <w:t xml:space="preserve">Time Horizon:</w:t>
             </w:r>
@@ -562,11 +853,19 @@
         </w:tc>
         <w:tc>
           <w:tcPr>
-            <w:tcW w:type="dxa" w:w="2800"/>
-          </w:tcPr>
-          <w:p>
-            <w:r>
-              <w:rPr>
+            <w:tcW w:type="dxa" w:w="3200"/>
+            <w:tcMar>
+              <w:top w:type="dxa" w:w="30"/>
+              <w:left w:type="dxa" w:w="80"/>
+              <w:bottom w:type="dxa" w:w="30"/>
+              <w:right w:type="dxa" w:w="80"/>
+            </w:tcMar>
+          </w:tcPr>
+          <w:p>
+            <w:r>
+              <w:rPr>
+                <w:rFonts w:ascii="Calibri" w:cs="Calibri" w:eastAsia="Calibri" w:hAnsi="Calibri"/>
+                <w:color w:val="2C3E50"/>
                 <w:sz w:val="20"/>
                 <w:szCs w:val="20"/>
               </w:rPr>
@@ -576,13 +875,23 @@
         </w:tc>
         <w:tc>
           <w:tcPr>
-            <w:tcW w:type="dxa" w:w="2200"/>
-          </w:tcPr>
-          <w:p>
-            <w:r>
-              <w:rPr>
-                <w:sz w:val="20"/>
-                <w:szCs w:val="20"/>
+            <w:tcW w:type="dxa" w:w="1800"/>
+            <w:tcMar>
+              <w:top w:type="dxa" w:w="30"/>
+              <w:left w:type="dxa" w:w="80"/>
+              <w:bottom w:type="dxa" w:w="30"/>
+              <w:right w:type="dxa" w:w="80"/>
+            </w:tcMar>
+          </w:tcPr>
+          <w:p>
+            <w:r>
+              <w:rPr>
+                <w:rFonts w:ascii="Calibri" w:cs="Calibri" w:eastAsia="Calibri" w:hAnsi="Calibri"/>
+                <w:b/>
+                <w:bCs/>
+                <w:color w:val="555555"/>
+                <w:sz w:val="19"/>
+                <w:szCs w:val="19"/>
               </w:rPr>
               <w:t xml:space="preserve"/>
             </w:r>
@@ -590,11 +899,19 @@
         </w:tc>
         <w:tc>
           <w:tcPr>
-            <w:tcW w:type="dxa" w:w="2800"/>
-          </w:tcPr>
-          <w:p>
-            <w:r>
-              <w:rPr>
+            <w:tcW w:type="dxa" w:w="3200"/>
+            <w:tcMar>
+              <w:top w:type="dxa" w:w="30"/>
+              <w:left w:type="dxa" w:w="80"/>
+              <w:bottom w:type="dxa" w:w="30"/>
+              <w:right w:type="dxa" w:w="80"/>
+            </w:tcMar>
+          </w:tcPr>
+          <w:p>
+            <w:r>
+              <w:rPr>
+                <w:rFonts w:ascii="Calibri" w:cs="Calibri" w:eastAsia="Calibri" w:hAnsi="Calibri"/>
+                <w:color w:val="2C3E50"/>
                 <w:sz w:val="20"/>
                 <w:szCs w:val="20"/>
               </w:rPr>
@@ -606,13 +923,14 @@
     </w:tbl>
     <w:p>
       <w:pPr>
-        <w:spacing w:after="100" w:before="100"/>
+        <w:spacing w:after="80" w:before="80"/>
       </w:pPr>
       <w:r>
         <w:rPr>
+          <w:rFonts w:ascii="Calibri" w:cs="Calibri" w:eastAsia="Calibri" w:hAnsi="Calibri"/>
           <w:b/>
           <w:bCs/>
-          <w:color w:val="444444"/>
+          <w:color w:val="555555"/>
           <w:sz w:val="20"/>
           <w:szCs w:val="20"/>
         </w:rPr>
@@ -620,6 +938,8 @@
       </w:r>
       <w:r>
         <w:rPr>
+          <w:rFonts w:ascii="Calibri" w:cs="Calibri" w:eastAsia="Calibri" w:hAnsi="Calibri"/>
+          <w:color w:val="2C3E50"/>
           <w:sz w:val="20"/>
           <w:szCs w:val="20"/>
         </w:rPr>
@@ -628,21 +948,24 @@
     </w:p>
     <w:p>
       <w:pPr>
-        <w:spacing w:after="80"/>
-      </w:pPr>
-    </w:p>
-    <w:p>
-      <w:pPr>
-        <w:pStyle w:val="Heading2"/>
-        <w:spacing w:after="100" w:before="300"/>
+        <w:spacing w:after="100"/>
+      </w:pPr>
+    </w:p>
+    <w:p>
+      <w:pPr>
+        <w:pBdr>
+          <w:bottom w:val="single" w:color="2E6DA4" w:sz="2"/>
+        </w:pBdr>
+        <w:spacing w:after="120" w:before="300"/>
       </w:pPr>
       <w:r>
         <w:rPr>
+          <w:rFonts w:ascii="Calibri" w:cs="Calibri" w:eastAsia="Calibri" w:hAnsi="Calibri"/>
           <w:b/>
           <w:bCs/>
-          <w:color w:val="1a3c6e"/>
-          <w:sz w:val="24"/>
-          <w:szCs w:val="24"/>
+          <w:color w:val="1B3A5C"/>
+          <w:sz w:val="26"/>
+          <w:szCs w:val="26"/>
         </w:rPr>
         <w:t xml:space="preserve">Client Goals</w:t>
       </w:r>
@@ -667,11 +990,18 @@
         <w:tc>
           <w:tcPr>
             <w:tcW w:type="dxa" w:w="600"/>
-            <w:shd w:color="1a3c6e" w:val="solid"/>
-          </w:tcPr>
-          <w:p>
-            <w:r>
-              <w:rPr>
+            <w:shd w:color="1B3A5C" w:val="solid"/>
+            <w:tcMar>
+              <w:top w:type="dxa" w:w="40"/>
+              <w:left w:type="dxa" w:w="80"/>
+              <w:bottom w:type="dxa" w:w="40"/>
+              <w:right w:type="dxa" w:w="80"/>
+            </w:tcMar>
+          </w:tcPr>
+          <w:p>
+            <w:r>
+              <w:rPr>
+                <w:rFonts w:ascii="Calibri" w:cs="Calibri" w:eastAsia="Calibri" w:hAnsi="Calibri"/>
                 <w:b/>
                 <w:bCs/>
                 <w:color w:val="FFFFFF"/>
@@ -685,11 +1015,18 @@
         <w:tc>
           <w:tcPr>
             <w:tcW w:type="dxa" w:w="9400"/>
-            <w:shd w:color="1a3c6e" w:val="solid"/>
-          </w:tcPr>
-          <w:p>
-            <w:r>
-              <w:rPr>
+            <w:shd w:color="1B3A5C" w:val="solid"/>
+            <w:tcMar>
+              <w:top w:type="dxa" w:w="40"/>
+              <w:left w:type="dxa" w:w="80"/>
+              <w:bottom w:type="dxa" w:w="40"/>
+              <w:right w:type="dxa" w:w="80"/>
+            </w:tcMar>
+          </w:tcPr>
+          <w:p>
+            <w:r>
+              <w:rPr>
+                <w:rFonts w:ascii="Calibri" w:cs="Calibri" w:eastAsia="Calibri" w:hAnsi="Calibri"/>
                 <w:b/>
                 <w:bCs/>
                 <w:color w:val="FFFFFF"/>
@@ -705,11 +1042,19 @@
         <w:tc>
           <w:tcPr>
             <w:tcW w:type="dxa" w:w="600"/>
-            <w:shd w:color="f0f4f8" w:val="solid"/>
-          </w:tcPr>
-          <w:p>
-            <w:r>
-              <w:rPr>
+            <w:shd w:color="F4F6F8" w:val="solid"/>
+            <w:tcMar>
+              <w:top w:type="dxa" w:w="30"/>
+              <w:left w:type="dxa" w:w="80"/>
+              <w:bottom w:type="dxa" w:w="30"/>
+              <w:right w:type="dxa" w:w="80"/>
+            </w:tcMar>
+          </w:tcPr>
+          <w:p>
+            <w:r>
+              <w:rPr>
+                <w:rFonts w:ascii="Calibri" w:cs="Calibri" w:eastAsia="Calibri" w:hAnsi="Calibri"/>
+                <w:color w:val="2C3E50"/>
                 <w:sz w:val="20"/>
                 <w:szCs w:val="20"/>
               </w:rPr>
@@ -720,11 +1065,19 @@
         <w:tc>
           <w:tcPr>
             <w:tcW w:type="dxa" w:w="9400"/>
-            <w:shd w:color="f0f4f8" w:val="solid"/>
-          </w:tcPr>
-          <w:p>
-            <w:r>
-              <w:rPr>
+            <w:shd w:color="F4F6F8" w:val="solid"/>
+            <w:tcMar>
+              <w:top w:type="dxa" w:w="30"/>
+              <w:left w:type="dxa" w:w="80"/>
+              <w:bottom w:type="dxa" w:w="30"/>
+              <w:right w:type="dxa" w:w="80"/>
+            </w:tcMar>
+          </w:tcPr>
+          <w:p>
+            <w:r>
+              <w:rPr>
+                <w:rFonts w:ascii="Calibri" w:cs="Calibri" w:eastAsia="Calibri" w:hAnsi="Calibri"/>
+                <w:color w:val="2C3E50"/>
                 <w:sz w:val="20"/>
                 <w:szCs w:val="20"/>
               </w:rPr>
@@ -737,10 +1090,18 @@
         <w:tc>
           <w:tcPr>
             <w:tcW w:type="dxa" w:w="600"/>
-          </w:tcPr>
-          <w:p>
-            <w:r>
-              <w:rPr>
+            <w:tcMar>
+              <w:top w:type="dxa" w:w="30"/>
+              <w:left w:type="dxa" w:w="80"/>
+              <w:bottom w:type="dxa" w:w="30"/>
+              <w:right w:type="dxa" w:w="80"/>
+            </w:tcMar>
+          </w:tcPr>
+          <w:p>
+            <w:r>
+              <w:rPr>
+                <w:rFonts w:ascii="Calibri" w:cs="Calibri" w:eastAsia="Calibri" w:hAnsi="Calibri"/>
+                <w:color w:val="2C3E50"/>
                 <w:sz w:val="20"/>
                 <w:szCs w:val="20"/>
               </w:rPr>
@@ -751,10 +1112,18 @@
         <w:tc>
           <w:tcPr>
             <w:tcW w:type="dxa" w:w="9400"/>
-          </w:tcPr>
-          <w:p>
-            <w:r>
-              <w:rPr>
+            <w:tcMar>
+              <w:top w:type="dxa" w:w="30"/>
+              <w:left w:type="dxa" w:w="80"/>
+              <w:bottom w:type="dxa" w:w="30"/>
+              <w:right w:type="dxa" w:w="80"/>
+            </w:tcMar>
+          </w:tcPr>
+          <w:p>
+            <w:r>
+              <w:rPr>
+                <w:rFonts w:ascii="Calibri" w:cs="Calibri" w:eastAsia="Calibri" w:hAnsi="Calibri"/>
+                <w:color w:val="2C3E50"/>
                 <w:sz w:val="20"/>
                 <w:szCs w:val="20"/>
               </w:rPr>
@@ -767,11 +1136,19 @@
         <w:tc>
           <w:tcPr>
             <w:tcW w:type="dxa" w:w="600"/>
-            <w:shd w:color="f0f4f8" w:val="solid"/>
-          </w:tcPr>
-          <w:p>
-            <w:r>
-              <w:rPr>
+            <w:shd w:color="F4F6F8" w:val="solid"/>
+            <w:tcMar>
+              <w:top w:type="dxa" w:w="30"/>
+              <w:left w:type="dxa" w:w="80"/>
+              <w:bottom w:type="dxa" w:w="30"/>
+              <w:right w:type="dxa" w:w="80"/>
+            </w:tcMar>
+          </w:tcPr>
+          <w:p>
+            <w:r>
+              <w:rPr>
+                <w:rFonts w:ascii="Calibri" w:cs="Calibri" w:eastAsia="Calibri" w:hAnsi="Calibri"/>
+                <w:color w:val="2C3E50"/>
                 <w:sz w:val="20"/>
                 <w:szCs w:val="20"/>
               </w:rPr>
@@ -782,11 +1159,19 @@
         <w:tc>
           <w:tcPr>
             <w:tcW w:type="dxa" w:w="9400"/>
-            <w:shd w:color="f0f4f8" w:val="solid"/>
-          </w:tcPr>
-          <w:p>
-            <w:r>
-              <w:rPr>
+            <w:shd w:color="F4F6F8" w:val="solid"/>
+            <w:tcMar>
+              <w:top w:type="dxa" w:w="30"/>
+              <w:left w:type="dxa" w:w="80"/>
+              <w:bottom w:type="dxa" w:w="30"/>
+              <w:right w:type="dxa" w:w="80"/>
+            </w:tcMar>
+          </w:tcPr>
+          <w:p>
+            <w:r>
+              <w:rPr>
+                <w:rFonts w:ascii="Calibri" w:cs="Calibri" w:eastAsia="Calibri" w:hAnsi="Calibri"/>
+                <w:color w:val="2C3E50"/>
                 <w:sz w:val="20"/>
                 <w:szCs w:val="20"/>
               </w:rPr>
@@ -798,13 +1183,14 @@
     </w:tbl>
     <w:p>
       <w:pPr>
-        <w:spacing w:after="100" w:before="100"/>
+        <w:spacing w:before="80"/>
       </w:pPr>
       <w:r>
         <w:rPr>
+          <w:rFonts w:ascii="Calibri" w:cs="Calibri" w:eastAsia="Calibri" w:hAnsi="Calibri"/>
           <w:b/>
           <w:bCs/>
-          <w:color w:val="444444"/>
+          <w:color w:val="555555"/>
           <w:sz w:val="20"/>
           <w:szCs w:val="20"/>
         </w:rPr>
@@ -812,6 +1198,8 @@
       </w:r>
       <w:r>
         <w:rPr>
+          <w:rFonts w:ascii="Calibri" w:cs="Calibri" w:eastAsia="Calibri" w:hAnsi="Calibri"/>
+          <w:color w:val="2C3E50"/>
           <w:sz w:val="20"/>
           <w:szCs w:val="20"/>
         </w:rPr>
@@ -820,21 +1208,24 @@
     </w:p>
     <w:p>
       <w:pPr>
-        <w:spacing w:after="80"/>
-      </w:pPr>
-    </w:p>
-    <w:p>
-      <w:pPr>
-        <w:pStyle w:val="Heading2"/>
-        <w:spacing w:after="100" w:before="300"/>
+        <w:spacing w:after="100"/>
+      </w:pPr>
+    </w:p>
+    <w:p>
+      <w:pPr>
+        <w:pBdr>
+          <w:bottom w:val="single" w:color="2E6DA4" w:sz="2"/>
+        </w:pBdr>
+        <w:spacing w:after="120" w:before="300"/>
       </w:pPr>
       <w:r>
         <w:rPr>
+          <w:rFonts w:ascii="Calibri" w:cs="Calibri" w:eastAsia="Calibri" w:hAnsi="Calibri"/>
           <w:b/>
           <w:bCs/>
-          <w:color w:val="1a3c6e"/>
-          <w:sz w:val="24"/>
-          <w:szCs w:val="24"/>
+          <w:color w:val="1B3A5C"/>
+          <w:sz w:val="26"/>
+          <w:szCs w:val="26"/>
         </w:rPr>
         <w:t xml:space="preserve">Meeting Discussion</w:t>
       </w:r>
@@ -843,12 +1234,12 @@
       <w:tblPr>
         <w:tblW w:type="pct" w:w="100%"/>
         <w:tblBorders>
-          <w:top w:val="none" w:color="FFFFFF" w:sz="0"/>
-          <w:left w:val="none" w:color="FFFFFF" w:sz="0"/>
-          <w:bottom w:val="none" w:color="FFFFFF" w:sz="0"/>
-          <w:right w:val="none" w:color="FFFFFF" w:sz="0"/>
-          <w:insideH w:val="none" w:color="FFFFFF" w:sz="0"/>
-          <w:insideV w:val="none" w:color="FFFFFF" w:sz="0"/>
+          <w:top w:val="none" w:sz="0"/>
+          <w:left w:val="none" w:sz="0"/>
+          <w:bottom w:val="none" w:sz="0"/>
+          <w:right w:val="none" w:sz="0"/>
+          <w:insideH w:val="none" w:sz="0"/>
+          <w:insideV w:val="none" w:sz="0"/>
         </w:tblBorders>
       </w:tblPr>
       <w:tblGrid>
@@ -860,13 +1251,23 @@
       <w:tr>
         <w:tc>
           <w:tcPr>
-            <w:tcW w:type="dxa" w:w="1500"/>
-          </w:tcPr>
-          <w:p>
-            <w:r>
-              <w:rPr>
-                <w:sz w:val="20"/>
-                <w:szCs w:val="20"/>
+            <w:tcW w:type="dxa" w:w="1200"/>
+            <w:tcMar>
+              <w:top w:type="dxa" w:w="30"/>
+              <w:left w:type="dxa" w:w="80"/>
+              <w:bottom w:type="dxa" w:w="30"/>
+              <w:right w:type="dxa" w:w="80"/>
+            </w:tcMar>
+          </w:tcPr>
+          <w:p>
+            <w:r>
+              <w:rPr>
+                <w:rFonts w:ascii="Calibri" w:cs="Calibri" w:eastAsia="Calibri" w:hAnsi="Calibri"/>
+                <w:b/>
+                <w:bCs/>
+                <w:color w:val="555555"/>
+                <w:sz w:val="19"/>
+                <w:szCs w:val="19"/>
               </w:rPr>
               <w:t xml:space="preserve">Date:</w:t>
             </w:r>
@@ -874,11 +1275,19 @@
         </w:tc>
         <w:tc>
           <w:tcPr>
-            <w:tcW w:type="dxa" w:w="3000"/>
-          </w:tcPr>
-          <w:p>
-            <w:r>
-              <w:rPr>
+            <w:tcW w:type="dxa" w:w="3800"/>
+            <w:tcMar>
+              <w:top w:type="dxa" w:w="30"/>
+              <w:left w:type="dxa" w:w="80"/>
+              <w:bottom w:type="dxa" w:w="30"/>
+              <w:right w:type="dxa" w:w="80"/>
+            </w:tcMar>
+          </w:tcPr>
+          <w:p>
+            <w:r>
+              <w:rPr>
+                <w:rFonts w:ascii="Calibri" w:cs="Calibri" w:eastAsia="Calibri" w:hAnsi="Calibri"/>
+                <w:color w:val="2C3E50"/>
                 <w:sz w:val="20"/>
                 <w:szCs w:val="20"/>
               </w:rPr>
@@ -888,13 +1297,23 @@
         </w:tc>
         <w:tc>
           <w:tcPr>
-            <w:tcW w:type="dxa" w:w="1500"/>
-          </w:tcPr>
-          <w:p>
-            <w:r>
-              <w:rPr>
-                <w:sz w:val="20"/>
-                <w:szCs w:val="20"/>
+            <w:tcW w:type="dxa" w:w="1200"/>
+            <w:tcMar>
+              <w:top w:type="dxa" w:w="30"/>
+              <w:left w:type="dxa" w:w="80"/>
+              <w:bottom w:type="dxa" w:w="30"/>
+              <w:right w:type="dxa" w:w="80"/>
+            </w:tcMar>
+          </w:tcPr>
+          <w:p>
+            <w:r>
+              <w:rPr>
+                <w:rFonts w:ascii="Calibri" w:cs="Calibri" w:eastAsia="Calibri" w:hAnsi="Calibri"/>
+                <w:b/>
+                <w:bCs/>
+                <w:color w:val="555555"/>
+                <w:sz w:val="19"/>
+                <w:szCs w:val="19"/>
               </w:rPr>
               <w:t xml:space="preserve">Location:</w:t>
             </w:r>
@@ -902,11 +1321,19 @@
         </w:tc>
         <w:tc>
           <w:tcPr>
-            <w:tcW w:type="dxa" w:w="4000"/>
-          </w:tcPr>
-          <w:p>
-            <w:r>
-              <w:rPr>
+            <w:tcW w:type="dxa" w:w="3800"/>
+            <w:tcMar>
+              <w:top w:type="dxa" w:w="30"/>
+              <w:left w:type="dxa" w:w="80"/>
+              <w:bottom w:type="dxa" w:w="30"/>
+              <w:right w:type="dxa" w:w="80"/>
+            </w:tcMar>
+          </w:tcPr>
+          <w:p>
+            <w:r>
+              <w:rPr>
+                <w:rFonts w:ascii="Calibri" w:cs="Calibri" w:eastAsia="Calibri" w:hAnsi="Calibri"/>
+                <w:color w:val="2C3E50"/>
                 <w:sz w:val="20"/>
                 <w:szCs w:val="20"/>
               </w:rPr>
@@ -918,13 +1345,23 @@
       <w:tr>
         <w:tc>
           <w:tcPr>
-            <w:tcW w:type="dxa" w:w="1500"/>
-          </w:tcPr>
-          <w:p>
-            <w:r>
-              <w:rPr>
-                <w:sz w:val="20"/>
-                <w:szCs w:val="20"/>
+            <w:tcW w:type="dxa" w:w="1200"/>
+            <w:tcMar>
+              <w:top w:type="dxa" w:w="30"/>
+              <w:left w:type="dxa" w:w="80"/>
+              <w:bottom w:type="dxa" w:w="30"/>
+              <w:right w:type="dxa" w:w="80"/>
+            </w:tcMar>
+          </w:tcPr>
+          <w:p>
+            <w:r>
+              <w:rPr>
+                <w:rFonts w:ascii="Calibri" w:cs="Calibri" w:eastAsia="Calibri" w:hAnsi="Calibri"/>
+                <w:b/>
+                <w:bCs/>
+                <w:color w:val="555555"/>
+                <w:sz w:val="19"/>
+                <w:szCs w:val="19"/>
               </w:rPr>
               <w:t xml:space="preserve">Duration:</w:t>
             </w:r>
@@ -932,11 +1369,19 @@
         </w:tc>
         <w:tc>
           <w:tcPr>
-            <w:tcW w:type="dxa" w:w="3000"/>
-          </w:tcPr>
-          <w:p>
-            <w:r>
-              <w:rPr>
+            <w:tcW w:type="dxa" w:w="3800"/>
+            <w:tcMar>
+              <w:top w:type="dxa" w:w="30"/>
+              <w:left w:type="dxa" w:w="80"/>
+              <w:bottom w:type="dxa" w:w="30"/>
+              <w:right w:type="dxa" w:w="80"/>
+            </w:tcMar>
+          </w:tcPr>
+          <w:p>
+            <w:r>
+              <w:rPr>
+                <w:rFonts w:ascii="Calibri" w:cs="Calibri" w:eastAsia="Calibri" w:hAnsi="Calibri"/>
+                <w:color w:val="2C3E50"/>
                 <w:sz w:val="20"/>
                 <w:szCs w:val="20"/>
               </w:rPr>
@@ -946,13 +1391,23 @@
         </w:tc>
         <w:tc>
           <w:tcPr>
-            <w:tcW w:type="dxa" w:w="1500"/>
-          </w:tcPr>
-          <w:p>
-            <w:r>
-              <w:rPr>
-                <w:sz w:val="20"/>
-                <w:szCs w:val="20"/>
+            <w:tcW w:type="dxa" w:w="1200"/>
+            <w:tcMar>
+              <w:top w:type="dxa" w:w="30"/>
+              <w:left w:type="dxa" w:w="80"/>
+              <w:bottom w:type="dxa" w:w="30"/>
+              <w:right w:type="dxa" w:w="80"/>
+            </w:tcMar>
+          </w:tcPr>
+          <w:p>
+            <w:r>
+              <w:rPr>
+                <w:rFonts w:ascii="Calibri" w:cs="Calibri" w:eastAsia="Calibri" w:hAnsi="Calibri"/>
+                <w:b/>
+                <w:bCs/>
+                <w:color w:val="555555"/>
+                <w:sz w:val="19"/>
+                <w:szCs w:val="19"/>
               </w:rPr>
               <w:t xml:space="preserve">Attendees:</w:t>
             </w:r>
@@ -960,11 +1415,19 @@
         </w:tc>
         <w:tc>
           <w:tcPr>
-            <w:tcW w:type="dxa" w:w="4000"/>
-          </w:tcPr>
-          <w:p>
-            <w:r>
-              <w:rPr>
+            <w:tcW w:type="dxa" w:w="3800"/>
+            <w:tcMar>
+              <w:top w:type="dxa" w:w="30"/>
+              <w:left w:type="dxa" w:w="80"/>
+              <w:bottom w:type="dxa" w:w="30"/>
+              <w:right w:type="dxa" w:w="80"/>
+            </w:tcMar>
+          </w:tcPr>
+          <w:p>
+            <w:r>
+              <w:rPr>
+                <w:rFonts w:ascii="Calibri" w:cs="Calibri" w:eastAsia="Calibri" w:hAnsi="Calibri"/>
+                <w:color w:val="2C3E50"/>
                 <w:sz w:val="20"/>
                 <w:szCs w:val="20"/>
               </w:rPr>
@@ -980,9 +1443,10 @@
       </w:pPr>
       <w:r>
         <w:rPr>
+          <w:rFonts w:ascii="Calibri" w:cs="Calibri" w:eastAsia="Calibri" w:hAnsi="Calibri"/>
           <w:b/>
           <w:bCs/>
-          <w:color w:val="444444"/>
+          <w:color w:val="555555"/>
           <w:sz w:val="20"/>
           <w:szCs w:val="20"/>
         </w:rPr>
@@ -991,11 +1455,12 @@
     </w:p>
     <w:p>
       <w:pPr>
-        <w:spacing w:after="40"/>
+        <w:spacing w:after="30"/>
         <w:ind w:left="360"/>
       </w:pPr>
       <w:r>
         <w:rPr>
+          <w:rFonts w:ascii="Calibri" w:cs="Calibri" w:eastAsia="Calibri" w:hAnsi="Calibri"/>
           <w:sz w:val="20"/>
           <w:szCs w:val="20"/>
         </w:rPr>
@@ -1004,11 +1469,12 @@
     </w:p>
     <w:p>
       <w:pPr>
-        <w:spacing w:after="40"/>
+        <w:spacing w:after="30"/>
         <w:ind w:left="360"/>
       </w:pPr>
       <w:r>
         <w:rPr>
+          <w:rFonts w:ascii="Calibri" w:cs="Calibri" w:eastAsia="Calibri" w:hAnsi="Calibri"/>
           <w:sz w:val="20"/>
           <w:szCs w:val="20"/>
         </w:rPr>
@@ -1017,11 +1483,12 @@
     </w:p>
     <w:p>
       <w:pPr>
-        <w:spacing w:after="40"/>
+        <w:spacing w:after="30"/>
         <w:ind w:left="360"/>
       </w:pPr>
       <w:r>
         <w:rPr>
+          <w:rFonts w:ascii="Calibri" w:cs="Calibri" w:eastAsia="Calibri" w:hAnsi="Calibri"/>
           <w:sz w:val="20"/>
           <w:szCs w:val="20"/>
         </w:rPr>
@@ -1030,13 +1497,14 @@
     </w:p>
     <w:p>
       <w:pPr>
-        <w:spacing w:after="100" w:before="100"/>
+        <w:spacing w:after="80" w:before="80"/>
       </w:pPr>
       <w:r>
         <w:rPr>
+          <w:rFonts w:ascii="Calibri" w:cs="Calibri" w:eastAsia="Calibri" w:hAnsi="Calibri"/>
           <w:b/>
           <w:bCs/>
-          <w:color w:val="444444"/>
+          <w:color w:val="555555"/>
           <w:sz w:val="20"/>
           <w:szCs w:val="20"/>
         </w:rPr>
@@ -1044,6 +1512,8 @@
       </w:r>
       <w:r>
         <w:rPr>
+          <w:rFonts w:ascii="Calibri" w:cs="Calibri" w:eastAsia="Calibri" w:hAnsi="Calibri"/>
+          <w:color w:val="2C3E50"/>
           <w:sz w:val="20"/>
           <w:szCs w:val="20"/>
         </w:rPr>
@@ -1052,21 +1522,24 @@
     </w:p>
     <w:p>
       <w:pPr>
-        <w:spacing w:after="80"/>
-      </w:pPr>
-    </w:p>
-    <w:p>
-      <w:pPr>
-        <w:pStyle w:val="Heading2"/>
-        <w:spacing w:after="100" w:before="300"/>
+        <w:spacing w:after="100"/>
+      </w:pPr>
+    </w:p>
+    <w:p>
+      <w:pPr>
+        <w:pBdr>
+          <w:bottom w:val="single" w:color="2E6DA4" w:sz="2"/>
+        </w:pBdr>
+        <w:spacing w:after="120" w:before="300"/>
       </w:pPr>
       <w:r>
         <w:rPr>
+          <w:rFonts w:ascii="Calibri" w:cs="Calibri" w:eastAsia="Calibri" w:hAnsi="Calibri"/>
           <w:b/>
           <w:bCs/>
-          <w:color w:val="1a3c6e"/>
-          <w:sz w:val="24"/>
-          <w:szCs w:val="24"/>
+          <w:color w:val="1B3A5C"/>
+          <w:sz w:val="26"/>
+          <w:szCs w:val="26"/>
         </w:rPr>
         <w:t xml:space="preserve">Action Items</w:t>
       </w:r>
@@ -1093,11 +1566,18 @@
         <w:tc>
           <w:tcPr>
             <w:tcW w:type="dxa" w:w="500"/>
-            <w:shd w:color="1a3c6e" w:val="solid"/>
-          </w:tcPr>
-          <w:p>
-            <w:r>
-              <w:rPr>
+            <w:shd w:color="1B3A5C" w:val="solid"/>
+            <w:tcMar>
+              <w:top w:type="dxa" w:w="40"/>
+              <w:left w:type="dxa" w:w="80"/>
+              <w:bottom w:type="dxa" w:w="40"/>
+              <w:right w:type="dxa" w:w="80"/>
+            </w:tcMar>
+          </w:tcPr>
+          <w:p>
+            <w:r>
+              <w:rPr>
+                <w:rFonts w:ascii="Calibri" w:cs="Calibri" w:eastAsia="Calibri" w:hAnsi="Calibri"/>
                 <w:b/>
                 <w:bCs/>
                 <w:color w:val="FFFFFF"/>
@@ -1111,11 +1591,18 @@
         <w:tc>
           <w:tcPr>
             <w:tcW w:type="dxa" w:w="5000"/>
-            <w:shd w:color="1a3c6e" w:val="solid"/>
-          </w:tcPr>
-          <w:p>
-            <w:r>
-              <w:rPr>
+            <w:shd w:color="1B3A5C" w:val="solid"/>
+            <w:tcMar>
+              <w:top w:type="dxa" w:w="40"/>
+              <w:left w:type="dxa" w:w="80"/>
+              <w:bottom w:type="dxa" w:w="40"/>
+              <w:right w:type="dxa" w:w="80"/>
+            </w:tcMar>
+          </w:tcPr>
+          <w:p>
+            <w:r>
+              <w:rPr>
+                <w:rFonts w:ascii="Calibri" w:cs="Calibri" w:eastAsia="Calibri" w:hAnsi="Calibri"/>
                 <w:b/>
                 <w:bCs/>
                 <w:color w:val="FFFFFF"/>
@@ -1128,12 +1615,19 @@
         </w:tc>
         <w:tc>
           <w:tcPr>
-            <w:tcW w:type="dxa" w:w="2000"/>
-            <w:shd w:color="1a3c6e" w:val="solid"/>
-          </w:tcPr>
-          <w:p>
-            <w:r>
-              <w:rPr>
+            <w:tcW w:type="dxa" w:w="2200"/>
+            <w:shd w:color="1B3A5C" w:val="solid"/>
+            <w:tcMar>
+              <w:top w:type="dxa" w:w="40"/>
+              <w:left w:type="dxa" w:w="80"/>
+              <w:bottom w:type="dxa" w:w="40"/>
+              <w:right w:type="dxa" w:w="80"/>
+            </w:tcMar>
+          </w:tcPr>
+          <w:p>
+            <w:r>
+              <w:rPr>
+                <w:rFonts w:ascii="Calibri" w:cs="Calibri" w:eastAsia="Calibri" w:hAnsi="Calibri"/>
                 <w:b/>
                 <w:bCs/>
                 <w:color w:val="FFFFFF"/>
@@ -1146,12 +1640,19 @@
         </w:tc>
         <w:tc>
           <w:tcPr>
-            <w:tcW w:type="dxa" w:w="2500"/>
-            <w:shd w:color="1a3c6e" w:val="solid"/>
-          </w:tcPr>
-          <w:p>
-            <w:r>
-              <w:rPr>
+            <w:tcW w:type="dxa" w:w="2300"/>
+            <w:shd w:color="1B3A5C" w:val="solid"/>
+            <w:tcMar>
+              <w:top w:type="dxa" w:w="40"/>
+              <w:left w:type="dxa" w:w="80"/>
+              <w:bottom w:type="dxa" w:w="40"/>
+              <w:right w:type="dxa" w:w="80"/>
+            </w:tcMar>
+          </w:tcPr>
+          <w:p>
+            <w:r>
+              <w:rPr>
+                <w:rFonts w:ascii="Calibri" w:cs="Calibri" w:eastAsia="Calibri" w:hAnsi="Calibri"/>
                 <w:b/>
                 <w:bCs/>
                 <w:color w:val="FFFFFF"/>
@@ -1167,11 +1668,19 @@
         <w:tc>
           <w:tcPr>
             <w:tcW w:type="dxa" w:w="500"/>
-            <w:shd w:color="f0f4f8" w:val="solid"/>
-          </w:tcPr>
-          <w:p>
-            <w:r>
-              <w:rPr>
+            <w:shd w:color="F4F6F8" w:val="solid"/>
+            <w:tcMar>
+              <w:top w:type="dxa" w:w="30"/>
+              <w:left w:type="dxa" w:w="80"/>
+              <w:bottom w:type="dxa" w:w="30"/>
+              <w:right w:type="dxa" w:w="80"/>
+            </w:tcMar>
+          </w:tcPr>
+          <w:p>
+            <w:r>
+              <w:rPr>
+                <w:rFonts w:ascii="Calibri" w:cs="Calibri" w:eastAsia="Calibri" w:hAnsi="Calibri"/>
+                <w:color w:val="2C3E50"/>
                 <w:sz w:val="20"/>
                 <w:szCs w:val="20"/>
               </w:rPr>
@@ -1182,11 +1691,19 @@
         <w:tc>
           <w:tcPr>
             <w:tcW w:type="dxa" w:w="5000"/>
-            <w:shd w:color="f0f4f8" w:val="solid"/>
-          </w:tcPr>
-          <w:p>
-            <w:r>
-              <w:rPr>
+            <w:shd w:color="F4F6F8" w:val="solid"/>
+            <w:tcMar>
+              <w:top w:type="dxa" w:w="30"/>
+              <w:left w:type="dxa" w:w="80"/>
+              <w:bottom w:type="dxa" w:w="30"/>
+              <w:right w:type="dxa" w:w="80"/>
+            </w:tcMar>
+          </w:tcPr>
+          <w:p>
+            <w:r>
+              <w:rPr>
+                <w:rFonts w:ascii="Calibri" w:cs="Calibri" w:eastAsia="Calibri" w:hAnsi="Calibri"/>
+                <w:color w:val="2C3E50"/>
                 <w:sz w:val="20"/>
                 <w:szCs w:val="20"/>
               </w:rPr>
@@ -1196,12 +1713,20 @@
         </w:tc>
         <w:tc>
           <w:tcPr>
-            <w:tcW w:type="dxa" w:w="2000"/>
-            <w:shd w:color="f0f4f8" w:val="solid"/>
-          </w:tcPr>
-          <w:p>
-            <w:r>
-              <w:rPr>
+            <w:tcW w:type="dxa" w:w="2200"/>
+            <w:shd w:color="F4F6F8" w:val="solid"/>
+            <w:tcMar>
+              <w:top w:type="dxa" w:w="30"/>
+              <w:left w:type="dxa" w:w="80"/>
+              <w:bottom w:type="dxa" w:w="30"/>
+              <w:right w:type="dxa" w:w="80"/>
+            </w:tcMar>
+          </w:tcPr>
+          <w:p>
+            <w:r>
+              <w:rPr>
+                <w:rFonts w:ascii="Calibri" w:cs="Calibri" w:eastAsia="Calibri" w:hAnsi="Calibri"/>
+                <w:color w:val="2C3E50"/>
                 <w:sz w:val="20"/>
                 <w:szCs w:val="20"/>
               </w:rPr>
@@ -1211,12 +1736,20 @@
         </w:tc>
         <w:tc>
           <w:tcPr>
-            <w:tcW w:type="dxa" w:w="2500"/>
-            <w:shd w:color="f0f4f8" w:val="solid"/>
-          </w:tcPr>
-          <w:p>
-            <w:r>
-              <w:rPr>
+            <w:tcW w:type="dxa" w:w="2300"/>
+            <w:shd w:color="F4F6F8" w:val="solid"/>
+            <w:tcMar>
+              <w:top w:type="dxa" w:w="30"/>
+              <w:left w:type="dxa" w:w="80"/>
+              <w:bottom w:type="dxa" w:w="30"/>
+              <w:right w:type="dxa" w:w="80"/>
+            </w:tcMar>
+          </w:tcPr>
+          <w:p>
+            <w:r>
+              <w:rPr>
+                <w:rFonts w:ascii="Calibri" w:cs="Calibri" w:eastAsia="Calibri" w:hAnsi="Calibri"/>
+                <w:color w:val="2C3E50"/>
                 <w:sz w:val="20"/>
                 <w:szCs w:val="20"/>
               </w:rPr>
@@ -1229,10 +1762,18 @@
         <w:tc>
           <w:tcPr>
             <w:tcW w:type="dxa" w:w="500"/>
-          </w:tcPr>
-          <w:p>
-            <w:r>
-              <w:rPr>
+            <w:tcMar>
+              <w:top w:type="dxa" w:w="30"/>
+              <w:left w:type="dxa" w:w="80"/>
+              <w:bottom w:type="dxa" w:w="30"/>
+              <w:right w:type="dxa" w:w="80"/>
+            </w:tcMar>
+          </w:tcPr>
+          <w:p>
+            <w:r>
+              <w:rPr>
+                <w:rFonts w:ascii="Calibri" w:cs="Calibri" w:eastAsia="Calibri" w:hAnsi="Calibri"/>
+                <w:color w:val="2C3E50"/>
                 <w:sz w:val="20"/>
                 <w:szCs w:val="20"/>
               </w:rPr>
@@ -1243,10 +1784,18 @@
         <w:tc>
           <w:tcPr>
             <w:tcW w:type="dxa" w:w="5000"/>
-          </w:tcPr>
-          <w:p>
-            <w:r>
-              <w:rPr>
+            <w:tcMar>
+              <w:top w:type="dxa" w:w="30"/>
+              <w:left w:type="dxa" w:w="80"/>
+              <w:bottom w:type="dxa" w:w="30"/>
+              <w:right w:type="dxa" w:w="80"/>
+            </w:tcMar>
+          </w:tcPr>
+          <w:p>
+            <w:r>
+              <w:rPr>
+                <w:rFonts w:ascii="Calibri" w:cs="Calibri" w:eastAsia="Calibri" w:hAnsi="Calibri"/>
+                <w:color w:val="2C3E50"/>
                 <w:sz w:val="20"/>
                 <w:szCs w:val="20"/>
               </w:rPr>
@@ -1256,11 +1805,19 @@
         </w:tc>
         <w:tc>
           <w:tcPr>
-            <w:tcW w:type="dxa" w:w="2000"/>
-          </w:tcPr>
-          <w:p>
-            <w:r>
-              <w:rPr>
+            <w:tcW w:type="dxa" w:w="2200"/>
+            <w:tcMar>
+              <w:top w:type="dxa" w:w="30"/>
+              <w:left w:type="dxa" w:w="80"/>
+              <w:bottom w:type="dxa" w:w="30"/>
+              <w:right w:type="dxa" w:w="80"/>
+            </w:tcMar>
+          </w:tcPr>
+          <w:p>
+            <w:r>
+              <w:rPr>
+                <w:rFonts w:ascii="Calibri" w:cs="Calibri" w:eastAsia="Calibri" w:hAnsi="Calibri"/>
+                <w:color w:val="2C3E50"/>
                 <w:sz w:val="20"/>
                 <w:szCs w:val="20"/>
               </w:rPr>
@@ -1270,11 +1827,19 @@
         </w:tc>
         <w:tc>
           <w:tcPr>
-            <w:tcW w:type="dxa" w:w="2500"/>
-          </w:tcPr>
-          <w:p>
-            <w:r>
-              <w:rPr>
+            <w:tcW w:type="dxa" w:w="2300"/>
+            <w:tcMar>
+              <w:top w:type="dxa" w:w="30"/>
+              <w:left w:type="dxa" w:w="80"/>
+              <w:bottom w:type="dxa" w:w="30"/>
+              <w:right w:type="dxa" w:w="80"/>
+            </w:tcMar>
+          </w:tcPr>
+          <w:p>
+            <w:r>
+              <w:rPr>
+                <w:rFonts w:ascii="Calibri" w:cs="Calibri" w:eastAsia="Calibri" w:hAnsi="Calibri"/>
+                <w:color w:val="2C3E50"/>
                 <w:sz w:val="20"/>
                 <w:szCs w:val="20"/>
               </w:rPr>
@@ -1287,11 +1852,19 @@
         <w:tc>
           <w:tcPr>
             <w:tcW w:type="dxa" w:w="500"/>
-            <w:shd w:color="f0f4f8" w:val="solid"/>
-          </w:tcPr>
-          <w:p>
-            <w:r>
-              <w:rPr>
+            <w:shd w:color="F4F6F8" w:val="solid"/>
+            <w:tcMar>
+              <w:top w:type="dxa" w:w="30"/>
+              <w:left w:type="dxa" w:w="80"/>
+              <w:bottom w:type="dxa" w:w="30"/>
+              <w:right w:type="dxa" w:w="80"/>
+            </w:tcMar>
+          </w:tcPr>
+          <w:p>
+            <w:r>
+              <w:rPr>
+                <w:rFonts w:ascii="Calibri" w:cs="Calibri" w:eastAsia="Calibri" w:hAnsi="Calibri"/>
+                <w:color w:val="2C3E50"/>
                 <w:sz w:val="20"/>
                 <w:szCs w:val="20"/>
               </w:rPr>
@@ -1302,11 +1875,19 @@
         <w:tc>
           <w:tcPr>
             <w:tcW w:type="dxa" w:w="5000"/>
-            <w:shd w:color="f0f4f8" w:val="solid"/>
-          </w:tcPr>
-          <w:p>
-            <w:r>
-              <w:rPr>
+            <w:shd w:color="F4F6F8" w:val="solid"/>
+            <w:tcMar>
+              <w:top w:type="dxa" w:w="30"/>
+              <w:left w:type="dxa" w:w="80"/>
+              <w:bottom w:type="dxa" w:w="30"/>
+              <w:right w:type="dxa" w:w="80"/>
+            </w:tcMar>
+          </w:tcPr>
+          <w:p>
+            <w:r>
+              <w:rPr>
+                <w:rFonts w:ascii="Calibri" w:cs="Calibri" w:eastAsia="Calibri" w:hAnsi="Calibri"/>
+                <w:color w:val="2C3E50"/>
                 <w:sz w:val="20"/>
                 <w:szCs w:val="20"/>
               </w:rPr>
@@ -1316,12 +1897,20 @@
         </w:tc>
         <w:tc>
           <w:tcPr>
-            <w:tcW w:type="dxa" w:w="2000"/>
-            <w:shd w:color="f0f4f8" w:val="solid"/>
-          </w:tcPr>
-          <w:p>
-            <w:r>
-              <w:rPr>
+            <w:tcW w:type="dxa" w:w="2200"/>
+            <w:shd w:color="F4F6F8" w:val="solid"/>
+            <w:tcMar>
+              <w:top w:type="dxa" w:w="30"/>
+              <w:left w:type="dxa" w:w="80"/>
+              <w:bottom w:type="dxa" w:w="30"/>
+              <w:right w:type="dxa" w:w="80"/>
+            </w:tcMar>
+          </w:tcPr>
+          <w:p>
+            <w:r>
+              <w:rPr>
+                <w:rFonts w:ascii="Calibri" w:cs="Calibri" w:eastAsia="Calibri" w:hAnsi="Calibri"/>
+                <w:color w:val="2C3E50"/>
                 <w:sz w:val="20"/>
                 <w:szCs w:val="20"/>
               </w:rPr>
@@ -1331,12 +1920,20 @@
         </w:tc>
         <w:tc>
           <w:tcPr>
-            <w:tcW w:type="dxa" w:w="2500"/>
-            <w:shd w:color="f0f4f8" w:val="solid"/>
-          </w:tcPr>
-          <w:p>
-            <w:r>
-              <w:rPr>
+            <w:tcW w:type="dxa" w:w="2300"/>
+            <w:shd w:color="F4F6F8" w:val="solid"/>
+            <w:tcMar>
+              <w:top w:type="dxa" w:w="30"/>
+              <w:left w:type="dxa" w:w="80"/>
+              <w:bottom w:type="dxa" w:w="30"/>
+              <w:right w:type="dxa" w:w="80"/>
+            </w:tcMar>
+          </w:tcPr>
+          <w:p>
+            <w:r>
+              <w:rPr>
+                <w:rFonts w:ascii="Calibri" w:cs="Calibri" w:eastAsia="Calibri" w:hAnsi="Calibri"/>
+                <w:color w:val="2C3E50"/>
                 <w:sz w:val="20"/>
                 <w:szCs w:val="20"/>
               </w:rPr>
@@ -1348,34 +1945,38 @@
     </w:tbl>
     <w:p>
       <w:pPr>
-        <w:spacing w:after="80"/>
-      </w:pPr>
-    </w:p>
-    <w:p>
-      <w:pPr>
-        <w:pStyle w:val="Heading2"/>
-        <w:spacing w:after="100" w:before="300"/>
+        <w:spacing w:after="100"/>
+      </w:pPr>
+    </w:p>
+    <w:p>
+      <w:pPr>
+        <w:pBdr>
+          <w:bottom w:val="single" w:color="2E6DA4" w:sz="2"/>
+        </w:pBdr>
+        <w:spacing w:after="120" w:before="300"/>
       </w:pPr>
       <w:r>
         <w:rPr>
+          <w:rFonts w:ascii="Calibri" w:cs="Calibri" w:eastAsia="Calibri" w:hAnsi="Calibri"/>
           <w:b/>
           <w:bCs/>
-          <w:color w:val="1a3c6e"/>
-          <w:sz w:val="24"/>
-          <w:szCs w:val="24"/>
+          <w:color w:val="1B3A5C"/>
+          <w:sz w:val="26"/>
+          <w:szCs w:val="26"/>
         </w:rPr>
         <w:t xml:space="preserve">Next Steps</w:t>
       </w:r>
     </w:p>
     <w:p>
       <w:pPr>
-        <w:spacing w:after="60"/>
+        <w:spacing w:after="40"/>
       </w:pPr>
       <w:r>
         <w:rPr>
+          <w:rFonts w:ascii="Calibri" w:cs="Calibri" w:eastAsia="Calibri" w:hAnsi="Calibri"/>
           <w:b/>
           <w:bCs/>
-          <w:color w:val="444444"/>
+          <w:color w:val="555555"/>
           <w:sz w:val="20"/>
           <w:szCs w:val="20"/>
         </w:rPr>
@@ -1383,6 +1984,8 @@
       </w:r>
       <w:r>
         <w:rPr>
+          <w:rFonts w:ascii="Calibri" w:cs="Calibri" w:eastAsia="Calibri" w:hAnsi="Calibri"/>
+          <w:color w:val="2C3E50"/>
           <w:sz w:val="20"/>
           <w:szCs w:val="20"/>
         </w:rPr>
@@ -1391,13 +1994,14 @@
     </w:p>
     <w:p>
       <w:pPr>
-        <w:spacing w:after="60"/>
+        <w:spacing w:after="40"/>
       </w:pPr>
       <w:r>
         <w:rPr>
+          <w:rFonts w:ascii="Calibri" w:cs="Calibri" w:eastAsia="Calibri" w:hAnsi="Calibri"/>
           <w:b/>
           <w:bCs/>
-          <w:color w:val="444444"/>
+          <w:color w:val="555555"/>
           <w:sz w:val="20"/>
           <w:szCs w:val="20"/>
         </w:rPr>
@@ -1405,6 +2009,8 @@
       </w:r>
       <w:r>
         <w:rPr>
+          <w:rFonts w:ascii="Calibri" w:cs="Calibri" w:eastAsia="Calibri" w:hAnsi="Calibri"/>
+          <w:color w:val="2C3E50"/>
           <w:sz w:val="20"/>
           <w:szCs w:val="20"/>
         </w:rPr>
@@ -1413,48 +2019,74 @@
     </w:p>
     <w:p>
       <w:pPr>
-        <w:spacing w:after="80"/>
-      </w:pPr>
-    </w:p>
-    <w:p>
-      <w:pPr>
-        <w:spacing w:after="80"/>
-      </w:pPr>
-    </w:p>
-    <w:p>
-      <w:pPr>
-        <w:spacing w:before="400"/>
-        <w:jc w:val="center"/>
-      </w:pPr>
-      <w:r>
-        <w:rPr>
-          <w:i/>
-          <w:iCs/>
-          <w:color w:val="999999"/>
-          <w:sz w:val="16"/>
-          <w:szCs w:val="16"/>
-        </w:rPr>
-        <w:t xml:space="preserve">This report was prepared by {{FIRM_NAME}} for {{CLIENT_NAME}}.</w:t>
-      </w:r>
-    </w:p>
-    <w:p>
-      <w:pPr>
-        <w:jc w:val="center"/>
-      </w:pPr>
-      <w:r>
-        <w:rPr>
-          <w:i/>
-          <w:iCs/>
-          <w:color w:val="999999"/>
-          <w:sz w:val="16"/>
-          <w:szCs w:val="16"/>
-        </w:rPr>
-        <w:t xml:space="preserve">Generated {{REPORT_DATE}} | Powered by DAX — Governed AI for RIAs</w:t>
-      </w:r>
-    </w:p>
+        <w:spacing w:after="200"/>
+      </w:pPr>
+    </w:p>
+    <w:tbl>
+      <w:tblPr>
+        <w:tblW w:type="pct" w:w="100%"/>
+        <w:tblBorders>
+          <w:top w:val="none" w:sz="0"/>
+          <w:left w:val="none" w:sz="0"/>
+          <w:bottom w:val="none" w:sz="0"/>
+          <w:right w:val="none" w:sz="0"/>
+          <w:insideH w:val="none" w:sz="0"/>
+          <w:insideV w:val="none" w:sz="0"/>
+        </w:tblBorders>
+      </w:tblPr>
+      <w:tblGrid>
+        <w:gridCol w:w="100"/>
+      </w:tblGrid>
+      <w:tr>
+        <w:tc>
+          <w:tcPr>
+            <w:tcW w:type="dxa" w:w="10000"/>
+            <w:shd w:color="1B3A5C" w:val="solid"/>
+            <w:tcMar>
+              <w:top w:type="dxa" w:w="80"/>
+              <w:left w:type="dxa" w:w="200"/>
+              <w:bottom w:type="dxa" w:w="80"/>
+              <w:right w:type="dxa" w:w="200"/>
+            </w:tcMar>
+          </w:tcPr>
+          <w:p>
+            <w:pPr>
+              <w:jc w:val="center"/>
+            </w:pPr>
+            <w:r>
+              <w:rPr>
+                <w:rFonts w:ascii="Calibri" w:cs="Calibri" w:eastAsia="Calibri" w:hAnsi="Calibri"/>
+                <w:i/>
+                <w:iCs/>
+                <w:color w:val="D6E4F0"/>
+                <w:sz w:val="17"/>
+                <w:szCs w:val="17"/>
+              </w:rPr>
+              <w:t xml:space="preserve">Generated {{REPORT_DATE}}  |  Powered by DAX — Governed AI for RIAs</w:t>
+            </w:r>
+          </w:p>
+          <w:p>
+            <w:pPr>
+              <w:jc w:val="center"/>
+            </w:pPr>
+            <w:r>
+              <w:rPr>
+                <w:rFonts w:ascii="Calibri" w:cs="Calibri" w:eastAsia="Calibri" w:hAnsi="Calibri"/>
+                <w:i/>
+                <w:iCs/>
+                <w:color w:val="D6E4F0"/>
+                <w:sz w:val="17"/>
+                <w:szCs w:val="17"/>
+              </w:rPr>
+              <w:t xml:space="preserve">Prepared by {{ADVISOR_NAME}} for {{CLIENT_NAME}}</w:t>
+            </w:r>
+          </w:p>
+        </w:tc>
+      </w:tr>
+    </w:tbl>
     <w:sectPr>
       <w:pgSz w:w="11906" w:h="16838" w:orient="portrait"/>
-      <w:pgMar w:top="720" w:right="900" w:bottom="720" w:left="900" w:header="708" w:footer="708" w:gutter="0"/>
+      <w:pgMar w:top="600" w:right="800" w:bottom="600" w:left="800" w:header="708" w:footer="708" w:gutter="0"/>
       <w:pgNumType/>
       <w:docGrid w:linePitch="360"/>
     </w:sectPr>
@@ -1641,7 +2273,7 @@
     <w:rPrDefault>
       <w:rPr>
         <w:rFonts w:ascii="Calibri" w:cs="Calibri" w:eastAsia="Calibri" w:hAnsi="Calibri"/>
-        <w:color w:val="333333"/>
+        <w:color w:val="2C3E50"/>
         <w:sz w:val="22"/>
         <w:szCs w:val="22"/>
       </w:rPr>

</xml_diff>

<commit_message>
fix: suppress empty rows in reports, dash placeholders for missing fields
Template:
- Goals, Action Items, Discussion Points use docxtemplater {{#loop}}
  syntax — empty items produce no rows instead of blank rows
- Advisor Notes, Progress Notes conditionally hidden when empty

Fill Placeholders:
- Empty scalar fields (Top Holding, Objective, Time Horizon, Background,
  Next Meeting, Agenda, Account Type, Risk Profile) show "—" instead of blank
- Goals/actions/discussions converted to filtered arrays before rendering

No styling or layout changes.

Co-Authored-By: Claude Opus 4.6 (1M context) <noreply@anthropic.com>
</commit_message>
<xml_diff>
--- a/docs/templates/Quarterly-Review-TEMPLATE.docx
+++ b/docs/templates/Quarterly-Review-TEMPLATE.docx
@@ -1058,7 +1058,7 @@
                 <w:sz w:val="20"/>
                 <w:szCs w:val="20"/>
               </w:rPr>
-              <w:t xml:space="preserve">1</w:t>
+              <w:t xml:space="preserve">{{#goals}}{{num}}</w:t>
             </w:r>
           </w:p>
         </w:tc>
@@ -1081,101 +1081,7 @@
                 <w:sz w:val="20"/>
                 <w:szCs w:val="20"/>
               </w:rPr>
-              <w:t xml:space="preserve">{{GOAL_1}}</w:t>
-            </w:r>
-          </w:p>
-        </w:tc>
-      </w:tr>
-      <w:tr>
-        <w:tc>
-          <w:tcPr>
-            <w:tcW w:type="dxa" w:w="600"/>
-            <w:tcMar>
-              <w:top w:type="dxa" w:w="30"/>
-              <w:left w:type="dxa" w:w="80"/>
-              <w:bottom w:type="dxa" w:w="30"/>
-              <w:right w:type="dxa" w:w="80"/>
-            </w:tcMar>
-          </w:tcPr>
-          <w:p>
-            <w:r>
-              <w:rPr>
-                <w:rFonts w:ascii="Calibri" w:cs="Calibri" w:eastAsia="Calibri" w:hAnsi="Calibri"/>
-                <w:color w:val="2C3E50"/>
-                <w:sz w:val="20"/>
-                <w:szCs w:val="20"/>
-              </w:rPr>
-              <w:t xml:space="preserve">2</w:t>
-            </w:r>
-          </w:p>
-        </w:tc>
-        <w:tc>
-          <w:tcPr>
-            <w:tcW w:type="dxa" w:w="9400"/>
-            <w:tcMar>
-              <w:top w:type="dxa" w:w="30"/>
-              <w:left w:type="dxa" w:w="80"/>
-              <w:bottom w:type="dxa" w:w="30"/>
-              <w:right w:type="dxa" w:w="80"/>
-            </w:tcMar>
-          </w:tcPr>
-          <w:p>
-            <w:r>
-              <w:rPr>
-                <w:rFonts w:ascii="Calibri" w:cs="Calibri" w:eastAsia="Calibri" w:hAnsi="Calibri"/>
-                <w:color w:val="2C3E50"/>
-                <w:sz w:val="20"/>
-                <w:szCs w:val="20"/>
-              </w:rPr>
-              <w:t xml:space="preserve">{{GOAL_2}}</w:t>
-            </w:r>
-          </w:p>
-        </w:tc>
-      </w:tr>
-      <w:tr>
-        <w:tc>
-          <w:tcPr>
-            <w:tcW w:type="dxa" w:w="600"/>
-            <w:shd w:color="F4F6F8" w:val="solid"/>
-            <w:tcMar>
-              <w:top w:type="dxa" w:w="30"/>
-              <w:left w:type="dxa" w:w="80"/>
-              <w:bottom w:type="dxa" w:w="30"/>
-              <w:right w:type="dxa" w:w="80"/>
-            </w:tcMar>
-          </w:tcPr>
-          <w:p>
-            <w:r>
-              <w:rPr>
-                <w:rFonts w:ascii="Calibri" w:cs="Calibri" w:eastAsia="Calibri" w:hAnsi="Calibri"/>
-                <w:color w:val="2C3E50"/>
-                <w:sz w:val="20"/>
-                <w:szCs w:val="20"/>
-              </w:rPr>
-              <w:t xml:space="preserve">3</w:t>
-            </w:r>
-          </w:p>
-        </w:tc>
-        <w:tc>
-          <w:tcPr>
-            <w:tcW w:type="dxa" w:w="9400"/>
-            <w:shd w:color="F4F6F8" w:val="solid"/>
-            <w:tcMar>
-              <w:top w:type="dxa" w:w="30"/>
-              <w:left w:type="dxa" w:w="80"/>
-              <w:bottom w:type="dxa" w:w="30"/>
-              <w:right w:type="dxa" w:w="80"/>
-            </w:tcMar>
-          </w:tcPr>
-          <w:p>
-            <w:r>
-              <w:rPr>
-                <w:rFonts w:ascii="Calibri" w:cs="Calibri" w:eastAsia="Calibri" w:hAnsi="Calibri"/>
-                <w:color w:val="2C3E50"/>
-                <w:sz w:val="20"/>
-                <w:szCs w:val="20"/>
-              </w:rPr>
-              <w:t xml:space="preserve">{{GOAL_3}}</w:t>
+              <w:t xml:space="preserve">{{text}}{{/goals}}</w:t>
             </w:r>
           </w:p>
         </w:tc>
@@ -1194,7 +1100,7 @@
           <w:sz w:val="20"/>
           <w:szCs w:val="20"/>
         </w:rPr>
-        <w:t xml:space="preserve">Progress Notes: </w:t>
+        <w:t xml:space="preserve">{{#GOALS_PROGRESS_NOTES}}Progress Notes: </w:t>
       </w:r>
       <w:r>
         <w:rPr>
@@ -1203,7 +1109,7 @@
           <w:sz w:val="20"/>
           <w:szCs w:val="20"/>
         </w:rPr>
-        <w:t xml:space="preserve">{{GOALS_PROGRESS_NOTES}}</w:t>
+        <w:t xml:space="preserve">{{GOALS_PROGRESS_NOTES}}{{/GOALS_PROGRESS_NOTES}}</w:t>
       </w:r>
     </w:p>
     <w:p>
@@ -1450,7 +1356,7 @@
           <w:sz w:val="20"/>
           <w:szCs w:val="20"/>
         </w:rPr>
-        <w:t xml:space="preserve">Key Discussion Points:</w:t>
+        <w:t xml:space="preserve">{{#discussions}}Key Discussion Points:</w:t>
       </w:r>
     </w:p>
     <w:p>
@@ -1464,35 +1370,7 @@
           <w:sz w:val="20"/>
           <w:szCs w:val="20"/>
         </w:rPr>
-        <w:t xml:space="preserve">1. {{DISCUSSION_POINT_1}}</w:t>
-      </w:r>
-    </w:p>
-    <w:p>
-      <w:pPr>
-        <w:spacing w:after="30"/>
-        <w:ind w:left="360"/>
-      </w:pPr>
-      <w:r>
-        <w:rPr>
-          <w:rFonts w:ascii="Calibri" w:cs="Calibri" w:eastAsia="Calibri" w:hAnsi="Calibri"/>
-          <w:sz w:val="20"/>
-          <w:szCs w:val="20"/>
-        </w:rPr>
-        <w:t xml:space="preserve">2. {{DISCUSSION_POINT_2}}</w:t>
-      </w:r>
-    </w:p>
-    <w:p>
-      <w:pPr>
-        <w:spacing w:after="30"/>
-        <w:ind w:left="360"/>
-      </w:pPr>
-      <w:r>
-        <w:rPr>
-          <w:rFonts w:ascii="Calibri" w:cs="Calibri" w:eastAsia="Calibri" w:hAnsi="Calibri"/>
-          <w:sz w:val="20"/>
-          <w:szCs w:val="20"/>
-        </w:rPr>
-        <w:t xml:space="preserve">3. {{DISCUSSION_POINT_3}}</w:t>
+        <w:t xml:space="preserve">{{num}}. {{text}}{{/discussions}}</w:t>
       </w:r>
     </w:p>
     <w:p>
@@ -1508,7 +1386,7 @@
           <w:sz w:val="20"/>
           <w:szCs w:val="20"/>
         </w:rPr>
-        <w:t xml:space="preserve">Advisor Notes: </w:t>
+        <w:t xml:space="preserve">{{#ADVISOR_NOTES}}Advisor Notes: </w:t>
       </w:r>
       <w:r>
         <w:rPr>
@@ -1517,7 +1395,7 @@
           <w:sz w:val="20"/>
           <w:szCs w:val="20"/>
         </w:rPr>
-        <w:t xml:space="preserve">{{ADVISOR_NOTES}}</w:t>
+        <w:t xml:space="preserve">{{ADVISOR_NOTES}}{{/ADVISOR_NOTES}}</w:t>
       </w:r>
     </w:p>
     <w:p>
@@ -1684,7 +1562,7 @@
                 <w:sz w:val="20"/>
                 <w:szCs w:val="20"/>
               </w:rPr>
-              <w:t xml:space="preserve">1</w:t>
+              <w:t xml:space="preserve">{{#actions}}{{num}}</w:t>
             </w:r>
           </w:p>
         </w:tc>
@@ -1707,7 +1585,7 @@
                 <w:sz w:val="20"/>
                 <w:szCs w:val="20"/>
               </w:rPr>
-              <w:t xml:space="preserve">{{ACTION_1}}</w:t>
+              <w:t xml:space="preserve">{{text}}</w:t>
             </w:r>
           </w:p>
         </w:tc>
@@ -1730,7 +1608,7 @@
                 <w:sz w:val="20"/>
                 <w:szCs w:val="20"/>
               </w:rPr>
-              <w:t xml:space="preserve">{{ACTION_1_OWNER}}</w:t>
+              <w:t xml:space="preserve">{{owner}}</w:t>
             </w:r>
           </w:p>
         </w:tc>
@@ -1753,191 +1631,7 @@
                 <w:sz w:val="20"/>
                 <w:szCs w:val="20"/>
               </w:rPr>
-              <w:t xml:space="preserve">{{ACTION_1_DUE}}</w:t>
-            </w:r>
-          </w:p>
-        </w:tc>
-      </w:tr>
-      <w:tr>
-        <w:tc>
-          <w:tcPr>
-            <w:tcW w:type="dxa" w:w="500"/>
-            <w:tcMar>
-              <w:top w:type="dxa" w:w="30"/>
-              <w:left w:type="dxa" w:w="80"/>
-              <w:bottom w:type="dxa" w:w="30"/>
-              <w:right w:type="dxa" w:w="80"/>
-            </w:tcMar>
-          </w:tcPr>
-          <w:p>
-            <w:r>
-              <w:rPr>
-                <w:rFonts w:ascii="Calibri" w:cs="Calibri" w:eastAsia="Calibri" w:hAnsi="Calibri"/>
-                <w:color w:val="2C3E50"/>
-                <w:sz w:val="20"/>
-                <w:szCs w:val="20"/>
-              </w:rPr>
-              <w:t xml:space="preserve">2</w:t>
-            </w:r>
-          </w:p>
-        </w:tc>
-        <w:tc>
-          <w:tcPr>
-            <w:tcW w:type="dxa" w:w="5000"/>
-            <w:tcMar>
-              <w:top w:type="dxa" w:w="30"/>
-              <w:left w:type="dxa" w:w="80"/>
-              <w:bottom w:type="dxa" w:w="30"/>
-              <w:right w:type="dxa" w:w="80"/>
-            </w:tcMar>
-          </w:tcPr>
-          <w:p>
-            <w:r>
-              <w:rPr>
-                <w:rFonts w:ascii="Calibri" w:cs="Calibri" w:eastAsia="Calibri" w:hAnsi="Calibri"/>
-                <w:color w:val="2C3E50"/>
-                <w:sz w:val="20"/>
-                <w:szCs w:val="20"/>
-              </w:rPr>
-              <w:t xml:space="preserve">{{ACTION_2}}</w:t>
-            </w:r>
-          </w:p>
-        </w:tc>
-        <w:tc>
-          <w:tcPr>
-            <w:tcW w:type="dxa" w:w="2200"/>
-            <w:tcMar>
-              <w:top w:type="dxa" w:w="30"/>
-              <w:left w:type="dxa" w:w="80"/>
-              <w:bottom w:type="dxa" w:w="30"/>
-              <w:right w:type="dxa" w:w="80"/>
-            </w:tcMar>
-          </w:tcPr>
-          <w:p>
-            <w:r>
-              <w:rPr>
-                <w:rFonts w:ascii="Calibri" w:cs="Calibri" w:eastAsia="Calibri" w:hAnsi="Calibri"/>
-                <w:color w:val="2C3E50"/>
-                <w:sz w:val="20"/>
-                <w:szCs w:val="20"/>
-              </w:rPr>
-              <w:t xml:space="preserve">{{ACTION_2_OWNER}}</w:t>
-            </w:r>
-          </w:p>
-        </w:tc>
-        <w:tc>
-          <w:tcPr>
-            <w:tcW w:type="dxa" w:w="2300"/>
-            <w:tcMar>
-              <w:top w:type="dxa" w:w="30"/>
-              <w:left w:type="dxa" w:w="80"/>
-              <w:bottom w:type="dxa" w:w="30"/>
-              <w:right w:type="dxa" w:w="80"/>
-            </w:tcMar>
-          </w:tcPr>
-          <w:p>
-            <w:r>
-              <w:rPr>
-                <w:rFonts w:ascii="Calibri" w:cs="Calibri" w:eastAsia="Calibri" w:hAnsi="Calibri"/>
-                <w:color w:val="2C3E50"/>
-                <w:sz w:val="20"/>
-                <w:szCs w:val="20"/>
-              </w:rPr>
-              <w:t xml:space="preserve">{{ACTION_2_DUE}}</w:t>
-            </w:r>
-          </w:p>
-        </w:tc>
-      </w:tr>
-      <w:tr>
-        <w:tc>
-          <w:tcPr>
-            <w:tcW w:type="dxa" w:w="500"/>
-            <w:shd w:color="F4F6F8" w:val="solid"/>
-            <w:tcMar>
-              <w:top w:type="dxa" w:w="30"/>
-              <w:left w:type="dxa" w:w="80"/>
-              <w:bottom w:type="dxa" w:w="30"/>
-              <w:right w:type="dxa" w:w="80"/>
-            </w:tcMar>
-          </w:tcPr>
-          <w:p>
-            <w:r>
-              <w:rPr>
-                <w:rFonts w:ascii="Calibri" w:cs="Calibri" w:eastAsia="Calibri" w:hAnsi="Calibri"/>
-                <w:color w:val="2C3E50"/>
-                <w:sz w:val="20"/>
-                <w:szCs w:val="20"/>
-              </w:rPr>
-              <w:t xml:space="preserve">3</w:t>
-            </w:r>
-          </w:p>
-        </w:tc>
-        <w:tc>
-          <w:tcPr>
-            <w:tcW w:type="dxa" w:w="5000"/>
-            <w:shd w:color="F4F6F8" w:val="solid"/>
-            <w:tcMar>
-              <w:top w:type="dxa" w:w="30"/>
-              <w:left w:type="dxa" w:w="80"/>
-              <w:bottom w:type="dxa" w:w="30"/>
-              <w:right w:type="dxa" w:w="80"/>
-            </w:tcMar>
-          </w:tcPr>
-          <w:p>
-            <w:r>
-              <w:rPr>
-                <w:rFonts w:ascii="Calibri" w:cs="Calibri" w:eastAsia="Calibri" w:hAnsi="Calibri"/>
-                <w:color w:val="2C3E50"/>
-                <w:sz w:val="20"/>
-                <w:szCs w:val="20"/>
-              </w:rPr>
-              <w:t xml:space="preserve">{{ACTION_3}}</w:t>
-            </w:r>
-          </w:p>
-        </w:tc>
-        <w:tc>
-          <w:tcPr>
-            <w:tcW w:type="dxa" w:w="2200"/>
-            <w:shd w:color="F4F6F8" w:val="solid"/>
-            <w:tcMar>
-              <w:top w:type="dxa" w:w="30"/>
-              <w:left w:type="dxa" w:w="80"/>
-              <w:bottom w:type="dxa" w:w="30"/>
-              <w:right w:type="dxa" w:w="80"/>
-            </w:tcMar>
-          </w:tcPr>
-          <w:p>
-            <w:r>
-              <w:rPr>
-                <w:rFonts w:ascii="Calibri" w:cs="Calibri" w:eastAsia="Calibri" w:hAnsi="Calibri"/>
-                <w:color w:val="2C3E50"/>
-                <w:sz w:val="20"/>
-                <w:szCs w:val="20"/>
-              </w:rPr>
-              <w:t xml:space="preserve">{{ACTION_3_OWNER}}</w:t>
-            </w:r>
-          </w:p>
-        </w:tc>
-        <w:tc>
-          <w:tcPr>
-            <w:tcW w:type="dxa" w:w="2300"/>
-            <w:shd w:color="F4F6F8" w:val="solid"/>
-            <w:tcMar>
-              <w:top w:type="dxa" w:w="30"/>
-              <w:left w:type="dxa" w:w="80"/>
-              <w:bottom w:type="dxa" w:w="30"/>
-              <w:right w:type="dxa" w:w="80"/>
-            </w:tcMar>
-          </w:tcPr>
-          <w:p>
-            <w:r>
-              <w:rPr>
-                <w:rFonts w:ascii="Calibri" w:cs="Calibri" w:eastAsia="Calibri" w:hAnsi="Calibri"/>
-                <w:color w:val="2C3E50"/>
-                <w:sz w:val="20"/>
-                <w:szCs w:val="20"/>
-              </w:rPr>
-              <w:t xml:space="preserve">{{ACTION_3_DUE}}</w:t>
+              <w:t xml:space="preserve">{{due}}{{/actions}}</w:t>
             </w:r>
           </w:p>
         </w:tc>

</xml_diff>